<commit_message>
Refactor: Clean up duplicate and 404 screenshots
Co-authored-by: chentianran <chentianran@shengdaxun.com>
</commit_message>
<xml_diff>
--- a/票务系统功能截图对照文档.docx
+++ b/票务系统功能截图对照文档.docx
@@ -12,7 +12,7 @@
           <w:rFonts w:ascii="Microsoft YaHei" w:hAnsi="Microsoft YaHei"/>
           <w:b/>
           <w:color w:val="003366"/>
-          <w:sz w:val="44"/>
+          <w:sz w:val="48"/>
         </w:rPr>
         <w:t>票务系统功能截图对照文档</w:t>
       </w:r>
@@ -24,7 +24,7 @@
           <w:color w:val="646464"/>
           <w:sz w:val="22"/>
         </w:rPr>
-        <w:t>本文档展示票务系统各功能模块的界面截图。注：部分功能可能需要特定权限才能访问。</w:t>
+        <w:t>本文档展示票务系统各功能模块的界面截图。</w:t>
       </w:r>
     </w:p>
     <w:p/>
@@ -36,7 +36,7 @@
         <w:rPr>
           <w:rFonts w:ascii="Microsoft YaHei" w:hAnsi="Microsoft YaHei"/>
           <w:color w:val="0066CC"/>
-          <w:sz w:val="36"/>
+          <w:sz w:val="32"/>
         </w:rPr>
         <w:t>一、票务管理</w:t>
       </w:r>
@@ -46,34 +46,62 @@
         <w:rPr>
           <w:rFonts w:ascii="Microsoft YaHei" w:hAnsi="Microsoft YaHei"/>
           <w:i/>
-          <w:sz w:val="22"/>
+          <w:color w:val="646464"/>
+          <w:sz w:val="20"/>
         </w:rPr>
         <w:t>雪票电子纸质的全面管理</w:t>
       </w:r>
     </w:p>
+    <w:p/>
     <w:tbl>
       <w:tblPr>
         <w:tblStyle w:val="LightGrid-Accent1"/>
         <w:tblW w:type="auto" w:w="0"/>
+        <w:jc w:val="center"/>
         <w:tblLook w:firstColumn="1" w:firstRow="1" w:lastColumn="0" w:lastRow="0" w:noHBand="0" w:noVBand="1" w:val="04A0"/>
       </w:tblPr>
       <w:tblGrid>
-        <w:gridCol w:w="8640"/>
+        <w:gridCol w:w="2268"/>
+        <w:gridCol w:w="7370"/>
       </w:tblGrid>
       <w:tr>
         <w:tc>
           <w:tcPr>
-            <w:tcW w:type="dxa" w:w="8640"/>
+            <w:tcW w:type="dxa" w:w="4986"/>
+            <w:shd w:fill="4472C4"/>
           </w:tcPr>
           <w:p>
+            <w:pPr>
+              <w:jc w:val="center"/>
+            </w:pPr>
             <w:r>
               <w:rPr>
                 <w:rFonts w:ascii="Microsoft YaHei" w:hAnsi="Microsoft YaHei"/>
                 <w:b/>
-                <w:color w:val="000000"/>
+                <w:color w:val="FFFFFF"/>
                 <w:sz w:val="24"/>
               </w:rPr>
-              <w:t>订单管理-票务管理</w:t>
+              <w:t>功能</w:t>
+            </w:r>
+          </w:p>
+        </w:tc>
+        <w:tc>
+          <w:tcPr>
+            <w:tcW w:type="dxa" w:w="4986"/>
+            <w:shd w:fill="4472C4"/>
+          </w:tcPr>
+          <w:p>
+            <w:pPr>
+              <w:jc w:val="center"/>
+            </w:pPr>
+            <w:r>
+              <w:rPr>
+                <w:rFonts w:ascii="Microsoft YaHei" w:hAnsi="Microsoft YaHei"/>
+                <w:b/>
+                <w:color w:val="FFFFFF"/>
+                <w:sz w:val="24"/>
+              </w:rPr>
+              <w:t>功能截图</w:t>
             </w:r>
           </w:p>
         </w:tc>
@@ -81,16 +109,35 @@
       <w:tr>
         <w:tc>
           <w:tcPr>
-            <w:tcW w:type="dxa" w:w="8640"/>
+            <w:tcW w:type="dxa" w:w="4986"/>
           </w:tcPr>
           <w:p>
             <w:pPr>
               <w:jc w:val="center"/>
             </w:pPr>
             <w:r>
+              <w:rPr>
+                <w:rFonts w:ascii="Microsoft YaHei" w:hAnsi="Microsoft YaHei"/>
+                <w:b/>
+                <w:sz w:val="22"/>
+              </w:rPr>
+              <w:t>票务管理</w:t>
+            </w:r>
+          </w:p>
+        </w:tc>
+        <w:tc>
+          <w:tcPr>
+            <w:tcW w:type="dxa" w:w="4986"/>
+          </w:tcPr>
+          <w:p>
+            <w:pPr>
+              <w:jc w:val="center"/>
+            </w:pPr>
+            <w:r/>
+            <w:r>
               <w:drawing>
                 <wp:inline xmlns:a="http://schemas.openxmlformats.org/drawingml/2006/main" xmlns:pic="http://schemas.openxmlformats.org/drawingml/2006/picture">
-                  <wp:extent cx="5486400" cy="3086100"/>
+                  <wp:extent cx="4320000" cy="2430000"/>
                   <wp:docPr id="1" name="Picture 1"/>
                   <wp:cNvGraphicFramePr>
                     <a:graphicFrameLocks noChangeAspect="1"/>
@@ -111,7 +158,7 @@
                         <pic:spPr>
                           <a:xfrm>
                             <a:off x="0" y="0"/>
-                            <a:ext cx="5486400" cy="3086100"/>
+                            <a:ext cx="4320000" cy="2430000"/>
                           </a:xfrm>
                           <a:prstGeom prst="rect"/>
                         </pic:spPr>
@@ -124,56 +171,38 @@
           </w:p>
         </w:tc>
       </w:tr>
-    </w:tbl>
-    <w:p/>
-    <w:tbl>
-      <w:tblPr>
-        <w:tblStyle w:val="LightGrid-Accent1"/>
-        <w:tblW w:type="auto" w:w="0"/>
-        <w:tblLook w:firstColumn="1" w:firstRow="1" w:lastColumn="0" w:lastRow="0" w:noHBand="0" w:noVBand="1" w:val="04A0"/>
-      </w:tblPr>
-      <w:tblGrid>
-        <w:gridCol w:w="8640"/>
-      </w:tblGrid>
       <w:tr>
         <w:tc>
           <w:tcPr>
-            <w:tcW w:type="dxa" w:w="8640"/>
-          </w:tcPr>
-          <w:p>
-            <w:r>
-              <w:rPr>
-                <w:rFonts w:ascii="Microsoft YaHei" w:hAnsi="Microsoft YaHei"/>
-                <w:b/>
-                <w:color w:val="000000"/>
-                <w:sz w:val="24"/>
-              </w:rPr>
-              <w:t>电子券列表</w:t>
-            </w:r>
-            <w:r>
-              <w:rPr>
-                <w:rFonts w:ascii="Microsoft YaHei" w:hAnsi="Microsoft YaHei"/>
-                <w:color w:val="404040"/>
-                <w:sz w:val="22"/>
-              </w:rPr>
-              <w:t xml:space="preserve"> - 票务管理-电子券列表</w:t>
-            </w:r>
-          </w:p>
-        </w:tc>
-      </w:tr>
-      <w:tr>
-        <w:tc>
-          <w:tcPr>
-            <w:tcW w:type="dxa" w:w="8640"/>
+            <w:tcW w:type="dxa" w:w="4986"/>
           </w:tcPr>
           <w:p>
             <w:pPr>
               <w:jc w:val="center"/>
             </w:pPr>
             <w:r>
+              <w:rPr>
+                <w:rFonts w:ascii="Microsoft YaHei" w:hAnsi="Microsoft YaHei"/>
+                <w:b/>
+                <w:sz w:val="22"/>
+              </w:rPr>
+              <w:t>电子券列表</w:t>
+            </w:r>
+          </w:p>
+        </w:tc>
+        <w:tc>
+          <w:tcPr>
+            <w:tcW w:type="dxa" w:w="4986"/>
+          </w:tcPr>
+          <w:p>
+            <w:pPr>
+              <w:jc w:val="center"/>
+            </w:pPr>
+            <w:r/>
+            <w:r>
               <w:drawing>
                 <wp:inline xmlns:a="http://schemas.openxmlformats.org/drawingml/2006/main" xmlns:pic="http://schemas.openxmlformats.org/drawingml/2006/picture">
-                  <wp:extent cx="5486400" cy="3086100"/>
+                  <wp:extent cx="4320000" cy="2430000"/>
                   <wp:docPr id="2" name="Picture 2"/>
                   <wp:cNvGraphicFramePr>
                     <a:graphicFrameLocks noChangeAspect="1"/>
@@ -194,7 +223,7 @@
                         <pic:spPr>
                           <a:xfrm>
                             <a:off x="0" y="0"/>
-                            <a:ext cx="5486400" cy="3086100"/>
+                            <a:ext cx="4320000" cy="2430000"/>
                           </a:xfrm>
                           <a:prstGeom prst="rect"/>
                         </pic:spPr>
@@ -207,56 +236,38 @@
           </w:p>
         </w:tc>
       </w:tr>
-    </w:tbl>
-    <w:p/>
-    <w:tbl>
-      <w:tblPr>
-        <w:tblStyle w:val="LightGrid-Accent1"/>
-        <w:tblW w:type="auto" w:w="0"/>
-        <w:tblLook w:firstColumn="1" w:firstRow="1" w:lastColumn="0" w:lastRow="0" w:noHBand="0" w:noVBand="1" w:val="04A0"/>
-      </w:tblPr>
-      <w:tblGrid>
-        <w:gridCol w:w="8640"/>
-      </w:tblGrid>
       <w:tr>
         <w:tc>
           <w:tcPr>
-            <w:tcW w:type="dxa" w:w="8640"/>
-          </w:tcPr>
-          <w:p>
-            <w:r>
-              <w:rPr>
-                <w:rFonts w:ascii="Microsoft YaHei" w:hAnsi="Microsoft YaHei"/>
-                <w:b/>
-                <w:color w:val="000000"/>
-                <w:sz w:val="24"/>
-              </w:rPr>
-              <w:t>电子票初始化</w:t>
-            </w:r>
-            <w:r>
-              <w:rPr>
-                <w:rFonts w:ascii="Microsoft YaHei" w:hAnsi="Microsoft YaHei"/>
-                <w:color w:val="404040"/>
-                <w:sz w:val="22"/>
-              </w:rPr>
-              <w:t xml:space="preserve"> - 票务管理-电子票初始化</w:t>
-            </w:r>
-          </w:p>
-        </w:tc>
-      </w:tr>
-      <w:tr>
-        <w:tc>
-          <w:tcPr>
-            <w:tcW w:type="dxa" w:w="8640"/>
+            <w:tcW w:type="dxa" w:w="4986"/>
           </w:tcPr>
           <w:p>
             <w:pPr>
               <w:jc w:val="center"/>
             </w:pPr>
             <w:r>
+              <w:rPr>
+                <w:rFonts w:ascii="Microsoft YaHei" w:hAnsi="Microsoft YaHei"/>
+                <w:b/>
+                <w:sz w:val="22"/>
+              </w:rPr>
+              <w:t>电子票初始化</w:t>
+            </w:r>
+          </w:p>
+        </w:tc>
+        <w:tc>
+          <w:tcPr>
+            <w:tcW w:type="dxa" w:w="4986"/>
+          </w:tcPr>
+          <w:p>
+            <w:pPr>
+              <w:jc w:val="center"/>
+            </w:pPr>
+            <w:r/>
+            <w:r>
               <w:drawing>
                 <wp:inline xmlns:a="http://schemas.openxmlformats.org/drawingml/2006/main" xmlns:pic="http://schemas.openxmlformats.org/drawingml/2006/picture">
-                  <wp:extent cx="5486400" cy="3086100"/>
+                  <wp:extent cx="4320000" cy="2430000"/>
                   <wp:docPr id="3" name="Picture 3"/>
                   <wp:cNvGraphicFramePr>
                     <a:graphicFrameLocks noChangeAspect="1"/>
@@ -277,7 +288,7 @@
                         <pic:spPr>
                           <a:xfrm>
                             <a:off x="0" y="0"/>
-                            <a:ext cx="5486400" cy="3086100"/>
+                            <a:ext cx="4320000" cy="2430000"/>
                           </a:xfrm>
                           <a:prstGeom prst="rect"/>
                         </pic:spPr>
@@ -290,56 +301,38 @@
           </w:p>
         </w:tc>
       </w:tr>
-    </w:tbl>
-    <w:p/>
-    <w:tbl>
-      <w:tblPr>
-        <w:tblStyle w:val="LightGrid-Accent1"/>
-        <w:tblW w:type="auto" w:w="0"/>
-        <w:tblLook w:firstColumn="1" w:firstRow="1" w:lastColumn="0" w:lastRow="0" w:noHBand="0" w:noVBand="1" w:val="04A0"/>
-      </w:tblPr>
-      <w:tblGrid>
-        <w:gridCol w:w="8640"/>
-      </w:tblGrid>
       <w:tr>
         <w:tc>
           <w:tcPr>
-            <w:tcW w:type="dxa" w:w="8640"/>
-          </w:tcPr>
-          <w:p>
-            <w:r>
-              <w:rPr>
-                <w:rFonts w:ascii="Microsoft YaHei" w:hAnsi="Microsoft YaHei"/>
-                <w:b/>
-                <w:color w:val="000000"/>
-                <w:sz w:val="24"/>
-              </w:rPr>
-              <w:t>纸制票模板</w:t>
-            </w:r>
-            <w:r>
-              <w:rPr>
-                <w:rFonts w:ascii="Microsoft YaHei" w:hAnsi="Microsoft YaHei"/>
-                <w:color w:val="404040"/>
-                <w:sz w:val="22"/>
-              </w:rPr>
-              <w:t xml:space="preserve"> - 票务管理-纸制票模板</w:t>
-            </w:r>
-          </w:p>
-        </w:tc>
-      </w:tr>
-      <w:tr>
-        <w:tc>
-          <w:tcPr>
-            <w:tcW w:type="dxa" w:w="8640"/>
+            <w:tcW w:type="dxa" w:w="4986"/>
           </w:tcPr>
           <w:p>
             <w:pPr>
               <w:jc w:val="center"/>
             </w:pPr>
             <w:r>
+              <w:rPr>
+                <w:rFonts w:ascii="Microsoft YaHei" w:hAnsi="Microsoft YaHei"/>
+                <w:b/>
+                <w:sz w:val="22"/>
+              </w:rPr>
+              <w:t>纸制票模板</w:t>
+            </w:r>
+          </w:p>
+        </w:tc>
+        <w:tc>
+          <w:tcPr>
+            <w:tcW w:type="dxa" w:w="4986"/>
+          </w:tcPr>
+          <w:p>
+            <w:pPr>
+              <w:jc w:val="center"/>
+            </w:pPr>
+            <w:r/>
+            <w:r>
               <w:drawing>
                 <wp:inline xmlns:a="http://schemas.openxmlformats.org/drawingml/2006/main" xmlns:pic="http://schemas.openxmlformats.org/drawingml/2006/picture">
-                  <wp:extent cx="5486400" cy="3086100"/>
+                  <wp:extent cx="4320000" cy="2430000"/>
                   <wp:docPr id="4" name="Picture 4"/>
                   <wp:cNvGraphicFramePr>
                     <a:graphicFrameLocks noChangeAspect="1"/>
@@ -360,7 +353,7 @@
                         <pic:spPr>
                           <a:xfrm>
                             <a:off x="0" y="0"/>
-                            <a:ext cx="5486400" cy="3086100"/>
+                            <a:ext cx="4320000" cy="2430000"/>
                           </a:xfrm>
                           <a:prstGeom prst="rect"/>
                         </pic:spPr>
@@ -383,7 +376,7 @@
         <w:rPr>
           <w:rFonts w:ascii="Microsoft YaHei" w:hAnsi="Microsoft YaHei"/>
           <w:color w:val="0066CC"/>
-          <w:sz w:val="36"/>
+          <w:sz w:val="32"/>
         </w:rPr>
         <w:t>二、订单管理</w:t>
       </w:r>
@@ -393,42 +386,62 @@
         <w:rPr>
           <w:rFonts w:ascii="Microsoft YaHei" w:hAnsi="Microsoft YaHei"/>
           <w:i/>
-          <w:sz w:val="22"/>
+          <w:color w:val="646464"/>
+          <w:sz w:val="20"/>
         </w:rPr>
         <w:t>对各类雪票、教务订单、租赁订单进行管理</w:t>
       </w:r>
     </w:p>
+    <w:p/>
     <w:tbl>
       <w:tblPr>
         <w:tblStyle w:val="LightGrid-Accent1"/>
         <w:tblW w:type="auto" w:w="0"/>
+        <w:jc w:val="center"/>
         <w:tblLook w:firstColumn="1" w:firstRow="1" w:lastColumn="0" w:lastRow="0" w:noHBand="0" w:noVBand="1" w:val="04A0"/>
       </w:tblPr>
       <w:tblGrid>
-        <w:gridCol w:w="8640"/>
+        <w:gridCol w:w="2268"/>
+        <w:gridCol w:w="7370"/>
       </w:tblGrid>
       <w:tr>
         <w:tc>
           <w:tcPr>
-            <w:tcW w:type="dxa" w:w="8640"/>
+            <w:tcW w:type="dxa" w:w="4986"/>
+            <w:shd w:fill="4472C4"/>
           </w:tcPr>
           <w:p>
+            <w:pPr>
+              <w:jc w:val="center"/>
+            </w:pPr>
             <w:r>
               <w:rPr>
                 <w:rFonts w:ascii="Microsoft YaHei" w:hAnsi="Microsoft YaHei"/>
                 <w:b/>
-                <w:color w:val="000000"/>
+                <w:color w:val="FFFFFF"/>
                 <w:sz w:val="24"/>
               </w:rPr>
-              <w:t>订单列表</w:t>
+              <w:t>功能</w:t>
             </w:r>
+          </w:p>
+        </w:tc>
+        <w:tc>
+          <w:tcPr>
+            <w:tcW w:type="dxa" w:w="4986"/>
+            <w:shd w:fill="4472C4"/>
+          </w:tcPr>
+          <w:p>
+            <w:pPr>
+              <w:jc w:val="center"/>
+            </w:pPr>
             <w:r>
               <w:rPr>
                 <w:rFonts w:ascii="Microsoft YaHei" w:hAnsi="Microsoft YaHei"/>
-                <w:color w:val="404040"/>
-                <w:sz w:val="22"/>
+                <w:b/>
+                <w:color w:val="FFFFFF"/>
+                <w:sz w:val="24"/>
               </w:rPr>
-              <w:t xml:space="preserve"> - 订单管理-订单列表</w:t>
+              <w:t>功能截图</w:t>
             </w:r>
           </w:p>
         </w:tc>
@@ -436,16 +449,35 @@
       <w:tr>
         <w:tc>
           <w:tcPr>
-            <w:tcW w:type="dxa" w:w="8640"/>
+            <w:tcW w:type="dxa" w:w="4986"/>
           </w:tcPr>
           <w:p>
             <w:pPr>
               <w:jc w:val="center"/>
             </w:pPr>
             <w:r>
+              <w:rPr>
+                <w:rFonts w:ascii="Microsoft YaHei" w:hAnsi="Microsoft YaHei"/>
+                <w:b/>
+                <w:sz w:val="22"/>
+              </w:rPr>
+              <w:t>订单列表</w:t>
+            </w:r>
+          </w:p>
+        </w:tc>
+        <w:tc>
+          <w:tcPr>
+            <w:tcW w:type="dxa" w:w="4986"/>
+          </w:tcPr>
+          <w:p>
+            <w:pPr>
+              <w:jc w:val="center"/>
+            </w:pPr>
+            <w:r/>
+            <w:r>
               <w:drawing>
                 <wp:inline xmlns:a="http://schemas.openxmlformats.org/drawingml/2006/main" xmlns:pic="http://schemas.openxmlformats.org/drawingml/2006/picture">
-                  <wp:extent cx="5486400" cy="3086100"/>
+                  <wp:extent cx="4320000" cy="2430000"/>
                   <wp:docPr id="5" name="Picture 5"/>
                   <wp:cNvGraphicFramePr>
                     <a:graphicFrameLocks noChangeAspect="1"/>
@@ -466,90 +498,7 @@
                         <pic:spPr>
                           <a:xfrm>
                             <a:off x="0" y="0"/>
-                            <a:ext cx="5486400" cy="3086100"/>
-                          </a:xfrm>
-                          <a:prstGeom prst="rect"/>
-                        </pic:spPr>
-                      </pic:pic>
-                    </a:graphicData>
-                  </a:graphic>
-                </wp:inline>
-              </w:drawing>
-            </w:r>
-          </w:p>
-        </w:tc>
-      </w:tr>
-    </w:tbl>
-    <w:p/>
-    <w:tbl>
-      <w:tblPr>
-        <w:tblStyle w:val="LightGrid-Accent1"/>
-        <w:tblW w:type="auto" w:w="0"/>
-        <w:tblLook w:firstColumn="1" w:firstRow="1" w:lastColumn="0" w:lastRow="0" w:noHBand="0" w:noVBand="1" w:val="04A0"/>
-      </w:tblPr>
-      <w:tblGrid>
-        <w:gridCol w:w="8640"/>
-      </w:tblGrid>
-      <w:tr>
-        <w:tc>
-          <w:tcPr>
-            <w:tcW w:type="dxa" w:w="8640"/>
-          </w:tcPr>
-          <w:p>
-            <w:r>
-              <w:rPr>
-                <w:rFonts w:ascii="Microsoft YaHei" w:hAnsi="Microsoft YaHei"/>
-                <w:b/>
-                <w:color w:val="000000"/>
-                <w:sz w:val="24"/>
-              </w:rPr>
-              <w:t>票务管理</w:t>
-            </w:r>
-            <w:r>
-              <w:rPr>
-                <w:rFonts w:ascii="Microsoft YaHei" w:hAnsi="Microsoft YaHei"/>
-                <w:color w:val="404040"/>
-                <w:sz w:val="22"/>
-              </w:rPr>
-              <w:t xml:space="preserve"> - 订单管理-票务管理</w:t>
-            </w:r>
-          </w:p>
-        </w:tc>
-      </w:tr>
-      <w:tr>
-        <w:tc>
-          <w:tcPr>
-            <w:tcW w:type="dxa" w:w="8640"/>
-          </w:tcPr>
-          <w:p>
-            <w:pPr>
-              <w:jc w:val="center"/>
-            </w:pPr>
-            <w:r>
-              <w:drawing>
-                <wp:inline xmlns:a="http://schemas.openxmlformats.org/drawingml/2006/main" xmlns:pic="http://schemas.openxmlformats.org/drawingml/2006/picture">
-                  <wp:extent cx="5486400" cy="3086100"/>
-                  <wp:docPr id="6" name="Picture 6"/>
-                  <wp:cNvGraphicFramePr>
-                    <a:graphicFrameLocks noChangeAspect="1"/>
-                  </wp:cNvGraphicFramePr>
-                  <a:graphic>
-                    <a:graphicData uri="http://schemas.openxmlformats.org/drawingml/2006/picture">
-                      <pic:pic>
-                        <pic:nvPicPr>
-                          <pic:cNvPr id="0" name="006_订单管理-票务管理.png"/>
-                          <pic:cNvPicPr/>
-                        </pic:nvPicPr>
-                        <pic:blipFill>
-                          <a:blip r:embed="rId9"/>
-                          <a:stretch>
-                            <a:fillRect/>
-                          </a:stretch>
-                        </pic:blipFill>
-                        <pic:spPr>
-                          <a:xfrm>
-                            <a:off x="0" y="0"/>
-                            <a:ext cx="5486400" cy="3086100"/>
+                            <a:ext cx="4320000" cy="2430000"/>
                           </a:xfrm>
                           <a:prstGeom prst="rect"/>
                         </pic:spPr>
@@ -572,7 +521,7 @@
         <w:rPr>
           <w:rFonts w:ascii="Microsoft YaHei" w:hAnsi="Microsoft YaHei"/>
           <w:color w:val="0066CC"/>
-          <w:sz w:val="36"/>
+          <w:sz w:val="32"/>
         </w:rPr>
         <w:t>三、工作台</w:t>
       </w:r>
@@ -582,42 +531,62 @@
         <w:rPr>
           <w:rFonts w:ascii="Microsoft YaHei" w:hAnsi="Microsoft YaHei"/>
           <w:i/>
-          <w:sz w:val="22"/>
+          <w:color w:val="646464"/>
+          <w:sz w:val="20"/>
         </w:rPr>
         <w:t>实现对现场售票及教练预约的下单管理</w:t>
       </w:r>
     </w:p>
+    <w:p/>
     <w:tbl>
       <w:tblPr>
         <w:tblStyle w:val="LightGrid-Accent1"/>
         <w:tblW w:type="auto" w:w="0"/>
+        <w:jc w:val="center"/>
         <w:tblLook w:firstColumn="1" w:firstRow="1" w:lastColumn="0" w:lastRow="0" w:noHBand="0" w:noVBand="1" w:val="04A0"/>
       </w:tblPr>
       <w:tblGrid>
-        <w:gridCol w:w="8640"/>
+        <w:gridCol w:w="2268"/>
+        <w:gridCol w:w="7370"/>
       </w:tblGrid>
       <w:tr>
         <w:tc>
           <w:tcPr>
-            <w:tcW w:type="dxa" w:w="8640"/>
+            <w:tcW w:type="dxa" w:w="4986"/>
+            <w:shd w:fill="4472C4"/>
           </w:tcPr>
           <w:p>
+            <w:pPr>
+              <w:jc w:val="center"/>
+            </w:pPr>
             <w:r>
               <w:rPr>
                 <w:rFonts w:ascii="Microsoft YaHei" w:hAnsi="Microsoft YaHei"/>
                 <w:b/>
-                <w:color w:val="000000"/>
+                <w:color w:val="FFFFFF"/>
                 <w:sz w:val="24"/>
               </w:rPr>
-              <w:t>收银</w:t>
+              <w:t>功能</w:t>
             </w:r>
+          </w:p>
+        </w:tc>
+        <w:tc>
+          <w:tcPr>
+            <w:tcW w:type="dxa" w:w="4986"/>
+            <w:shd w:fill="4472C4"/>
+          </w:tcPr>
+          <w:p>
+            <w:pPr>
+              <w:jc w:val="center"/>
+            </w:pPr>
             <w:r>
               <w:rPr>
                 <w:rFonts w:ascii="Microsoft YaHei" w:hAnsi="Microsoft YaHei"/>
-                <w:color w:val="404040"/>
-                <w:sz w:val="22"/>
+                <w:b/>
+                <w:color w:val="FFFFFF"/>
+                <w:sz w:val="24"/>
               </w:rPr>
-              <w:t xml:space="preserve"> - 工作台-收银</w:t>
+              <w:t>功能截图</w:t>
             </w:r>
           </w:p>
         </w:tc>
@@ -625,17 +594,36 @@
       <w:tr>
         <w:tc>
           <w:tcPr>
-            <w:tcW w:type="dxa" w:w="8640"/>
+            <w:tcW w:type="dxa" w:w="4986"/>
           </w:tcPr>
           <w:p>
             <w:pPr>
               <w:jc w:val="center"/>
             </w:pPr>
             <w:r>
+              <w:rPr>
+                <w:rFonts w:ascii="Microsoft YaHei" w:hAnsi="Microsoft YaHei"/>
+                <w:b/>
+                <w:sz w:val="22"/>
+              </w:rPr>
+              <w:t>收银</w:t>
+            </w:r>
+          </w:p>
+        </w:tc>
+        <w:tc>
+          <w:tcPr>
+            <w:tcW w:type="dxa" w:w="4986"/>
+          </w:tcPr>
+          <w:p>
+            <w:pPr>
+              <w:jc w:val="center"/>
+            </w:pPr>
+            <w:r/>
+            <w:r>
               <w:drawing>
                 <wp:inline xmlns:a="http://schemas.openxmlformats.org/drawingml/2006/main" xmlns:pic="http://schemas.openxmlformats.org/drawingml/2006/picture">
-                  <wp:extent cx="5486400" cy="3086100"/>
-                  <wp:docPr id="7" name="Picture 7"/>
+                  <wp:extent cx="4320000" cy="2430000"/>
+                  <wp:docPr id="6" name="Picture 6"/>
                   <wp:cNvGraphicFramePr>
                     <a:graphicFrameLocks noChangeAspect="1"/>
                   </wp:cNvGraphicFramePr>
@@ -655,7 +643,7 @@
                         <pic:spPr>
                           <a:xfrm>
                             <a:off x="0" y="0"/>
-                            <a:ext cx="5486400" cy="3086100"/>
+                            <a:ext cx="4320000" cy="2430000"/>
                           </a:xfrm>
                           <a:prstGeom prst="rect"/>
                         </pic:spPr>
@@ -668,57 +656,39 @@
           </w:p>
         </w:tc>
       </w:tr>
-    </w:tbl>
-    <w:p/>
-    <w:tbl>
-      <w:tblPr>
-        <w:tblStyle w:val="LightGrid-Accent1"/>
-        <w:tblW w:type="auto" w:w="0"/>
-        <w:tblLook w:firstColumn="1" w:firstRow="1" w:lastColumn="0" w:lastRow="0" w:noHBand="0" w:noVBand="1" w:val="04A0"/>
-      </w:tblPr>
-      <w:tblGrid>
-        <w:gridCol w:w="8640"/>
-      </w:tblGrid>
       <w:tr>
         <w:tc>
           <w:tcPr>
-            <w:tcW w:type="dxa" w:w="8640"/>
-          </w:tcPr>
-          <w:p>
-            <w:r>
-              <w:rPr>
-                <w:rFonts w:ascii="Microsoft YaHei" w:hAnsi="Microsoft YaHei"/>
-                <w:b/>
-                <w:color w:val="000000"/>
-                <w:sz w:val="24"/>
-              </w:rPr>
-              <w:t>发卡</w:t>
-            </w:r>
-            <w:r>
-              <w:rPr>
-                <w:rFonts w:ascii="Microsoft YaHei" w:hAnsi="Microsoft YaHei"/>
-                <w:color w:val="404040"/>
-                <w:sz w:val="22"/>
-              </w:rPr>
-              <w:t xml:space="preserve"> - 工作台-发卡</w:t>
-            </w:r>
-          </w:p>
-        </w:tc>
-      </w:tr>
-      <w:tr>
-        <w:tc>
-          <w:tcPr>
-            <w:tcW w:type="dxa" w:w="8640"/>
+            <w:tcW w:type="dxa" w:w="4986"/>
           </w:tcPr>
           <w:p>
             <w:pPr>
               <w:jc w:val="center"/>
             </w:pPr>
             <w:r>
+              <w:rPr>
+                <w:rFonts w:ascii="Microsoft YaHei" w:hAnsi="Microsoft YaHei"/>
+                <w:b/>
+                <w:sz w:val="22"/>
+              </w:rPr>
+              <w:t>发卡</w:t>
+            </w:r>
+          </w:p>
+        </w:tc>
+        <w:tc>
+          <w:tcPr>
+            <w:tcW w:type="dxa" w:w="4986"/>
+          </w:tcPr>
+          <w:p>
+            <w:pPr>
+              <w:jc w:val="center"/>
+            </w:pPr>
+            <w:r/>
+            <w:r>
               <w:drawing>
                 <wp:inline xmlns:a="http://schemas.openxmlformats.org/drawingml/2006/main" xmlns:pic="http://schemas.openxmlformats.org/drawingml/2006/picture">
-                  <wp:extent cx="5486400" cy="3086100"/>
-                  <wp:docPr id="8" name="Picture 8"/>
+                  <wp:extent cx="4320000" cy="2430000"/>
+                  <wp:docPr id="7" name="Picture 7"/>
                   <wp:cNvGraphicFramePr>
                     <a:graphicFrameLocks noChangeAspect="1"/>
                   </wp:cNvGraphicFramePr>
@@ -738,7 +708,7 @@
                         <pic:spPr>
                           <a:xfrm>
                             <a:off x="0" y="0"/>
-                            <a:ext cx="5486400" cy="3086100"/>
+                            <a:ext cx="4320000" cy="2430000"/>
                           </a:xfrm>
                           <a:prstGeom prst="rect"/>
                         </pic:spPr>
@@ -751,57 +721,39 @@
           </w:p>
         </w:tc>
       </w:tr>
-    </w:tbl>
-    <w:p/>
-    <w:tbl>
-      <w:tblPr>
-        <w:tblStyle w:val="LightGrid-Accent1"/>
-        <w:tblW w:type="auto" w:w="0"/>
-        <w:tblLook w:firstColumn="1" w:firstRow="1" w:lastColumn="0" w:lastRow="0" w:noHBand="0" w:noVBand="1" w:val="04A0"/>
-      </w:tblPr>
-      <w:tblGrid>
-        <w:gridCol w:w="8640"/>
-      </w:tblGrid>
       <w:tr>
         <w:tc>
           <w:tcPr>
-            <w:tcW w:type="dxa" w:w="8640"/>
-          </w:tcPr>
-          <w:p>
-            <w:r>
-              <w:rPr>
-                <w:rFonts w:ascii="Microsoft YaHei" w:hAnsi="Microsoft YaHei"/>
-                <w:b/>
-                <w:color w:val="000000"/>
-                <w:sz w:val="24"/>
-              </w:rPr>
-              <w:t>还卡</w:t>
-            </w:r>
-            <w:r>
-              <w:rPr>
-                <w:rFonts w:ascii="Microsoft YaHei" w:hAnsi="Microsoft YaHei"/>
-                <w:color w:val="404040"/>
-                <w:sz w:val="22"/>
-              </w:rPr>
-              <w:t xml:space="preserve"> - 工作台-还卡</w:t>
-            </w:r>
-          </w:p>
-        </w:tc>
-      </w:tr>
-      <w:tr>
-        <w:tc>
-          <w:tcPr>
-            <w:tcW w:type="dxa" w:w="8640"/>
+            <w:tcW w:type="dxa" w:w="4986"/>
           </w:tcPr>
           <w:p>
             <w:pPr>
               <w:jc w:val="center"/>
             </w:pPr>
             <w:r>
+              <w:rPr>
+                <w:rFonts w:ascii="Microsoft YaHei" w:hAnsi="Microsoft YaHei"/>
+                <w:b/>
+                <w:sz w:val="22"/>
+              </w:rPr>
+              <w:t>还卡</w:t>
+            </w:r>
+          </w:p>
+        </w:tc>
+        <w:tc>
+          <w:tcPr>
+            <w:tcW w:type="dxa" w:w="4986"/>
+          </w:tcPr>
+          <w:p>
+            <w:pPr>
+              <w:jc w:val="center"/>
+            </w:pPr>
+            <w:r/>
+            <w:r>
               <w:drawing>
                 <wp:inline xmlns:a="http://schemas.openxmlformats.org/drawingml/2006/main" xmlns:pic="http://schemas.openxmlformats.org/drawingml/2006/picture">
-                  <wp:extent cx="5486400" cy="3086100"/>
-                  <wp:docPr id="9" name="Picture 9"/>
+                  <wp:extent cx="4320000" cy="2430000"/>
+                  <wp:docPr id="8" name="Picture 8"/>
                   <wp:cNvGraphicFramePr>
                     <a:graphicFrameLocks noChangeAspect="1"/>
                   </wp:cNvGraphicFramePr>
@@ -821,7 +773,7 @@
                         <pic:spPr>
                           <a:xfrm>
                             <a:off x="0" y="0"/>
-                            <a:ext cx="5486400" cy="3086100"/>
+                            <a:ext cx="4320000" cy="2430000"/>
                           </a:xfrm>
                           <a:prstGeom prst="rect"/>
                         </pic:spPr>
@@ -844,7 +796,7 @@
         <w:rPr>
           <w:rFonts w:ascii="Microsoft YaHei" w:hAnsi="Microsoft YaHei"/>
           <w:color w:val="0066CC"/>
-          <w:sz w:val="36"/>
+          <w:sz w:val="32"/>
         </w:rPr>
         <w:t>四、通行管理</w:t>
       </w:r>
@@ -854,42 +806,62 @@
         <w:rPr>
           <w:rFonts w:ascii="Microsoft YaHei" w:hAnsi="Microsoft YaHei"/>
           <w:i/>
-          <w:sz w:val="22"/>
+          <w:color w:val="646464"/>
+          <w:sz w:val="20"/>
         </w:rPr>
         <w:t>通过闸机的管控实现对进出雪场的人员进行管理；通行方式可以是人脸或雪票二维码</w:t>
       </w:r>
     </w:p>
+    <w:p/>
     <w:tbl>
       <w:tblPr>
         <w:tblStyle w:val="LightGrid-Accent1"/>
         <w:tblW w:type="auto" w:w="0"/>
+        <w:jc w:val="center"/>
         <w:tblLook w:firstColumn="1" w:firstRow="1" w:lastColumn="0" w:lastRow="0" w:noHBand="0" w:noVBand="1" w:val="04A0"/>
       </w:tblPr>
       <w:tblGrid>
-        <w:gridCol w:w="8640"/>
+        <w:gridCol w:w="2268"/>
+        <w:gridCol w:w="7370"/>
       </w:tblGrid>
       <w:tr>
         <w:tc>
           <w:tcPr>
-            <w:tcW w:type="dxa" w:w="8640"/>
+            <w:tcW w:type="dxa" w:w="4986"/>
+            <w:shd w:fill="4472C4"/>
           </w:tcPr>
           <w:p>
+            <w:pPr>
+              <w:jc w:val="center"/>
+            </w:pPr>
             <w:r>
               <w:rPr>
                 <w:rFonts w:ascii="Microsoft YaHei" w:hAnsi="Microsoft YaHei"/>
                 <w:b/>
-                <w:color w:val="000000"/>
+                <w:color w:val="FFFFFF"/>
                 <w:sz w:val="24"/>
               </w:rPr>
-              <w:t>人脸库</w:t>
+              <w:t>功能</w:t>
             </w:r>
+          </w:p>
+        </w:tc>
+        <w:tc>
+          <w:tcPr>
+            <w:tcW w:type="dxa" w:w="4986"/>
+            <w:shd w:fill="4472C4"/>
+          </w:tcPr>
+          <w:p>
+            <w:pPr>
+              <w:jc w:val="center"/>
+            </w:pPr>
             <w:r>
               <w:rPr>
                 <w:rFonts w:ascii="Microsoft YaHei" w:hAnsi="Microsoft YaHei"/>
-                <w:color w:val="404040"/>
-                <w:sz w:val="22"/>
+                <w:b/>
+                <w:color w:val="FFFFFF"/>
+                <w:sz w:val="24"/>
               </w:rPr>
-              <w:t xml:space="preserve"> - 通行管理-人脸库</w:t>
+              <w:t>功能截图</w:t>
             </w:r>
           </w:p>
         </w:tc>
@@ -897,17 +869,36 @@
       <w:tr>
         <w:tc>
           <w:tcPr>
-            <w:tcW w:type="dxa" w:w="8640"/>
+            <w:tcW w:type="dxa" w:w="4986"/>
           </w:tcPr>
           <w:p>
             <w:pPr>
               <w:jc w:val="center"/>
             </w:pPr>
             <w:r>
+              <w:rPr>
+                <w:rFonts w:ascii="Microsoft YaHei" w:hAnsi="Microsoft YaHei"/>
+                <w:b/>
+                <w:sz w:val="22"/>
+              </w:rPr>
+              <w:t>人脸库</w:t>
+            </w:r>
+          </w:p>
+        </w:tc>
+        <w:tc>
+          <w:tcPr>
+            <w:tcW w:type="dxa" w:w="4986"/>
+          </w:tcPr>
+          <w:p>
+            <w:pPr>
+              <w:jc w:val="center"/>
+            </w:pPr>
+            <w:r/>
+            <w:r>
               <w:drawing>
                 <wp:inline xmlns:a="http://schemas.openxmlformats.org/drawingml/2006/main" xmlns:pic="http://schemas.openxmlformats.org/drawingml/2006/picture">
-                  <wp:extent cx="5486400" cy="3086100"/>
-                  <wp:docPr id="10" name="Picture 10"/>
+                  <wp:extent cx="4320000" cy="2430000"/>
+                  <wp:docPr id="9" name="Picture 9"/>
                   <wp:cNvGraphicFramePr>
                     <a:graphicFrameLocks noChangeAspect="1"/>
                   </wp:cNvGraphicFramePr>
@@ -927,7 +918,7 @@
                         <pic:spPr>
                           <a:xfrm>
                             <a:off x="0" y="0"/>
-                            <a:ext cx="5486400" cy="3086100"/>
+                            <a:ext cx="4320000" cy="2430000"/>
                           </a:xfrm>
                           <a:prstGeom prst="rect"/>
                         </pic:spPr>
@@ -940,57 +931,39 @@
           </w:p>
         </w:tc>
       </w:tr>
-    </w:tbl>
-    <w:p/>
-    <w:tbl>
-      <w:tblPr>
-        <w:tblStyle w:val="LightGrid-Accent1"/>
-        <w:tblW w:type="auto" w:w="0"/>
-        <w:tblLook w:firstColumn="1" w:firstRow="1" w:lastColumn="0" w:lastRow="0" w:noHBand="0" w:noVBand="1" w:val="04A0"/>
-      </w:tblPr>
-      <w:tblGrid>
-        <w:gridCol w:w="8640"/>
-      </w:tblGrid>
       <w:tr>
         <w:tc>
           <w:tcPr>
-            <w:tcW w:type="dxa" w:w="8640"/>
-          </w:tcPr>
-          <w:p>
-            <w:r>
-              <w:rPr>
-                <w:rFonts w:ascii="Microsoft YaHei" w:hAnsi="Microsoft YaHei"/>
-                <w:b/>
-                <w:color w:val="000000"/>
-                <w:sz w:val="24"/>
-              </w:rPr>
-              <w:t>闸机配置</w:t>
-            </w:r>
-            <w:r>
-              <w:rPr>
-                <w:rFonts w:ascii="Microsoft YaHei" w:hAnsi="Microsoft YaHei"/>
-                <w:color w:val="404040"/>
-                <w:sz w:val="22"/>
-              </w:rPr>
-              <w:t xml:space="preserve"> - 通行管理-闸机配置</w:t>
-            </w:r>
-          </w:p>
-        </w:tc>
-      </w:tr>
-      <w:tr>
-        <w:tc>
-          <w:tcPr>
-            <w:tcW w:type="dxa" w:w="8640"/>
+            <w:tcW w:type="dxa" w:w="4986"/>
           </w:tcPr>
           <w:p>
             <w:pPr>
               <w:jc w:val="center"/>
             </w:pPr>
             <w:r>
+              <w:rPr>
+                <w:rFonts w:ascii="Microsoft YaHei" w:hAnsi="Microsoft YaHei"/>
+                <w:b/>
+                <w:sz w:val="22"/>
+              </w:rPr>
+              <w:t>闸机配置</w:t>
+            </w:r>
+          </w:p>
+        </w:tc>
+        <w:tc>
+          <w:tcPr>
+            <w:tcW w:type="dxa" w:w="4986"/>
+          </w:tcPr>
+          <w:p>
+            <w:pPr>
+              <w:jc w:val="center"/>
+            </w:pPr>
+            <w:r/>
+            <w:r>
               <w:drawing>
                 <wp:inline xmlns:a="http://schemas.openxmlformats.org/drawingml/2006/main" xmlns:pic="http://schemas.openxmlformats.org/drawingml/2006/picture">
-                  <wp:extent cx="5486400" cy="3086100"/>
-                  <wp:docPr id="11" name="Picture 11"/>
+                  <wp:extent cx="4320000" cy="2430000"/>
+                  <wp:docPr id="10" name="Picture 10"/>
                   <wp:cNvGraphicFramePr>
                     <a:graphicFrameLocks noChangeAspect="1"/>
                   </wp:cNvGraphicFramePr>
@@ -1010,7 +983,7 @@
                         <pic:spPr>
                           <a:xfrm>
                             <a:off x="0" y="0"/>
-                            <a:ext cx="5486400" cy="3086100"/>
+                            <a:ext cx="4320000" cy="2430000"/>
                           </a:xfrm>
                           <a:prstGeom prst="rect"/>
                         </pic:spPr>
@@ -1033,7 +1006,7 @@
         <w:rPr>
           <w:rFonts w:ascii="Microsoft YaHei" w:hAnsi="Microsoft YaHei"/>
           <w:color w:val="0066CC"/>
-          <w:sz w:val="36"/>
+          <w:sz w:val="32"/>
         </w:rPr>
         <w:t>五、控制面板</w:t>
       </w:r>
@@ -1043,42 +1016,62 @@
         <w:rPr>
           <w:rFonts w:ascii="Microsoft YaHei" w:hAnsi="Microsoft YaHei"/>
           <w:i/>
-          <w:sz w:val="22"/>
+          <w:color w:val="646464"/>
+          <w:sz w:val="20"/>
         </w:rPr>
         <w:t>包括对雪票产品设置、电子/纸质票设置、闸机配置、售票小程序、教练、分销商、节假日、租赁物等运营参数的管理</w:t>
       </w:r>
     </w:p>
+    <w:p/>
     <w:tbl>
       <w:tblPr>
         <w:tblStyle w:val="LightGrid-Accent1"/>
         <w:tblW w:type="auto" w:w="0"/>
+        <w:jc w:val="center"/>
         <w:tblLook w:firstColumn="1" w:firstRow="1" w:lastColumn="0" w:lastRow="0" w:noHBand="0" w:noVBand="1" w:val="04A0"/>
       </w:tblPr>
       <w:tblGrid>
-        <w:gridCol w:w="8640"/>
+        <w:gridCol w:w="2268"/>
+        <w:gridCol w:w="7370"/>
       </w:tblGrid>
       <w:tr>
         <w:tc>
           <w:tcPr>
-            <w:tcW w:type="dxa" w:w="8640"/>
+            <w:tcW w:type="dxa" w:w="4986"/>
+            <w:shd w:fill="4472C4"/>
           </w:tcPr>
           <w:p>
+            <w:pPr>
+              <w:jc w:val="center"/>
+            </w:pPr>
             <w:r>
               <w:rPr>
                 <w:rFonts w:ascii="Microsoft YaHei" w:hAnsi="Microsoft YaHei"/>
                 <w:b/>
-                <w:color w:val="000000"/>
+                <w:color w:val="FFFFFF"/>
                 <w:sz w:val="24"/>
               </w:rPr>
-              <w:t>产品管理</w:t>
+              <w:t>功能</w:t>
             </w:r>
+          </w:p>
+        </w:tc>
+        <w:tc>
+          <w:tcPr>
+            <w:tcW w:type="dxa" w:w="4986"/>
+            <w:shd w:fill="4472C4"/>
+          </w:tcPr>
+          <w:p>
+            <w:pPr>
+              <w:jc w:val="center"/>
+            </w:pPr>
             <w:r>
               <w:rPr>
                 <w:rFonts w:ascii="Microsoft YaHei" w:hAnsi="Microsoft YaHei"/>
-                <w:color w:val="404040"/>
-                <w:sz w:val="22"/>
+                <w:b/>
+                <w:color w:val="FFFFFF"/>
+                <w:sz w:val="24"/>
               </w:rPr>
-              <w:t xml:space="preserve"> - 控制面板-产品管理</w:t>
+              <w:t>功能截图</w:t>
             </w:r>
           </w:p>
         </w:tc>
@@ -1086,17 +1079,36 @@
       <w:tr>
         <w:tc>
           <w:tcPr>
-            <w:tcW w:type="dxa" w:w="8640"/>
+            <w:tcW w:type="dxa" w:w="4986"/>
           </w:tcPr>
           <w:p>
             <w:pPr>
               <w:jc w:val="center"/>
             </w:pPr>
             <w:r>
+              <w:rPr>
+                <w:rFonts w:ascii="Microsoft YaHei" w:hAnsi="Microsoft YaHei"/>
+                <w:b/>
+                <w:sz w:val="22"/>
+              </w:rPr>
+              <w:t>产品管理</w:t>
+            </w:r>
+          </w:p>
+        </w:tc>
+        <w:tc>
+          <w:tcPr>
+            <w:tcW w:type="dxa" w:w="4986"/>
+          </w:tcPr>
+          <w:p>
+            <w:pPr>
+              <w:jc w:val="center"/>
+            </w:pPr>
+            <w:r/>
+            <w:r>
               <w:drawing>
                 <wp:inline xmlns:a="http://schemas.openxmlformats.org/drawingml/2006/main" xmlns:pic="http://schemas.openxmlformats.org/drawingml/2006/picture">
-                  <wp:extent cx="5486400" cy="3086100"/>
-                  <wp:docPr id="12" name="Picture 12"/>
+                  <wp:extent cx="4320000" cy="2430000"/>
+                  <wp:docPr id="11" name="Picture 11"/>
                   <wp:cNvGraphicFramePr>
                     <a:graphicFrameLocks noChangeAspect="1"/>
                   </wp:cNvGraphicFramePr>
@@ -1116,7 +1128,7 @@
                         <pic:spPr>
                           <a:xfrm>
                             <a:off x="0" y="0"/>
-                            <a:ext cx="5486400" cy="3086100"/>
+                            <a:ext cx="4320000" cy="2430000"/>
                           </a:xfrm>
                           <a:prstGeom prst="rect"/>
                         </pic:spPr>
@@ -1129,57 +1141,39 @@
           </w:p>
         </w:tc>
       </w:tr>
-    </w:tbl>
-    <w:p/>
-    <w:tbl>
-      <w:tblPr>
-        <w:tblStyle w:val="LightGrid-Accent1"/>
-        <w:tblW w:type="auto" w:w="0"/>
-        <w:tblLook w:firstColumn="1" w:firstRow="1" w:lastColumn="0" w:lastRow="0" w:noHBand="0" w:noVBand="1" w:val="04A0"/>
-      </w:tblPr>
-      <w:tblGrid>
-        <w:gridCol w:w="8640"/>
-      </w:tblGrid>
       <w:tr>
         <w:tc>
           <w:tcPr>
-            <w:tcW w:type="dxa" w:w="8640"/>
-          </w:tcPr>
-          <w:p>
-            <w:r>
-              <w:rPr>
-                <w:rFonts w:ascii="Microsoft YaHei" w:hAnsi="Microsoft YaHei"/>
-                <w:b/>
-                <w:color w:val="000000"/>
-                <w:sz w:val="24"/>
-              </w:rPr>
-              <w:t>产品分类</w:t>
-            </w:r>
-            <w:r>
-              <w:rPr>
-                <w:rFonts w:ascii="Microsoft YaHei" w:hAnsi="Microsoft YaHei"/>
-                <w:color w:val="404040"/>
-                <w:sz w:val="22"/>
-              </w:rPr>
-              <w:t xml:space="preserve"> - 控制面板-产品分类</w:t>
-            </w:r>
-          </w:p>
-        </w:tc>
-      </w:tr>
-      <w:tr>
-        <w:tc>
-          <w:tcPr>
-            <w:tcW w:type="dxa" w:w="8640"/>
+            <w:tcW w:type="dxa" w:w="4986"/>
           </w:tcPr>
           <w:p>
             <w:pPr>
               <w:jc w:val="center"/>
             </w:pPr>
             <w:r>
+              <w:rPr>
+                <w:rFonts w:ascii="Microsoft YaHei" w:hAnsi="Microsoft YaHei"/>
+                <w:b/>
+                <w:sz w:val="22"/>
+              </w:rPr>
+              <w:t>产品分类</w:t>
+            </w:r>
+          </w:p>
+        </w:tc>
+        <w:tc>
+          <w:tcPr>
+            <w:tcW w:type="dxa" w:w="4986"/>
+          </w:tcPr>
+          <w:p>
+            <w:pPr>
+              <w:jc w:val="center"/>
+            </w:pPr>
+            <w:r/>
+            <w:r>
               <w:drawing>
                 <wp:inline xmlns:a="http://schemas.openxmlformats.org/drawingml/2006/main" xmlns:pic="http://schemas.openxmlformats.org/drawingml/2006/picture">
-                  <wp:extent cx="5486400" cy="3086100"/>
-                  <wp:docPr id="13" name="Picture 13"/>
+                  <wp:extent cx="4320000" cy="2430000"/>
+                  <wp:docPr id="12" name="Picture 12"/>
                   <wp:cNvGraphicFramePr>
                     <a:graphicFrameLocks noChangeAspect="1"/>
                   </wp:cNvGraphicFramePr>
@@ -1199,7 +1193,7 @@
                         <pic:spPr>
                           <a:xfrm>
                             <a:off x="0" y="0"/>
-                            <a:ext cx="5486400" cy="3086100"/>
+                            <a:ext cx="4320000" cy="2430000"/>
                           </a:xfrm>
                           <a:prstGeom prst="rect"/>
                         </pic:spPr>
@@ -1212,57 +1206,39 @@
           </w:p>
         </w:tc>
       </w:tr>
-    </w:tbl>
-    <w:p/>
-    <w:tbl>
-      <w:tblPr>
-        <w:tblStyle w:val="LightGrid-Accent1"/>
-        <w:tblW w:type="auto" w:w="0"/>
-        <w:tblLook w:firstColumn="1" w:firstRow="1" w:lastColumn="0" w:lastRow="0" w:noHBand="0" w:noVBand="1" w:val="04A0"/>
-      </w:tblPr>
-      <w:tblGrid>
-        <w:gridCol w:w="8640"/>
-      </w:tblGrid>
       <w:tr>
         <w:tc>
           <w:tcPr>
-            <w:tcW w:type="dxa" w:w="8640"/>
-          </w:tcPr>
-          <w:p>
-            <w:r>
-              <w:rPr>
-                <w:rFonts w:ascii="Microsoft YaHei" w:hAnsi="Microsoft YaHei"/>
-                <w:b/>
-                <w:color w:val="000000"/>
-                <w:sz w:val="24"/>
-              </w:rPr>
-              <w:t>节假日设置</w:t>
-            </w:r>
-            <w:r>
-              <w:rPr>
-                <w:rFonts w:ascii="Microsoft YaHei" w:hAnsi="Microsoft YaHei"/>
-                <w:color w:val="404040"/>
-                <w:sz w:val="22"/>
-              </w:rPr>
-              <w:t xml:space="preserve"> - 控制面板-节假日设置</w:t>
-            </w:r>
-          </w:p>
-        </w:tc>
-      </w:tr>
-      <w:tr>
-        <w:tc>
-          <w:tcPr>
-            <w:tcW w:type="dxa" w:w="8640"/>
+            <w:tcW w:type="dxa" w:w="4986"/>
           </w:tcPr>
           <w:p>
             <w:pPr>
               <w:jc w:val="center"/>
             </w:pPr>
             <w:r>
+              <w:rPr>
+                <w:rFonts w:ascii="Microsoft YaHei" w:hAnsi="Microsoft YaHei"/>
+                <w:b/>
+                <w:sz w:val="22"/>
+              </w:rPr>
+              <w:t>节假日设置</w:t>
+            </w:r>
+          </w:p>
+        </w:tc>
+        <w:tc>
+          <w:tcPr>
+            <w:tcW w:type="dxa" w:w="4986"/>
+          </w:tcPr>
+          <w:p>
+            <w:pPr>
+              <w:jc w:val="center"/>
+            </w:pPr>
+            <w:r/>
+            <w:r>
               <w:drawing>
                 <wp:inline xmlns:a="http://schemas.openxmlformats.org/drawingml/2006/main" xmlns:pic="http://schemas.openxmlformats.org/drawingml/2006/picture">
-                  <wp:extent cx="5486400" cy="3086100"/>
-                  <wp:docPr id="14" name="Picture 14"/>
+                  <wp:extent cx="4320000" cy="2430000"/>
+                  <wp:docPr id="13" name="Picture 13"/>
                   <wp:cNvGraphicFramePr>
                     <a:graphicFrameLocks noChangeAspect="1"/>
                   </wp:cNvGraphicFramePr>
@@ -1282,7 +1258,7 @@
                         <pic:spPr>
                           <a:xfrm>
                             <a:off x="0" y="0"/>
-                            <a:ext cx="5486400" cy="3086100"/>
+                            <a:ext cx="4320000" cy="2430000"/>
                           </a:xfrm>
                           <a:prstGeom prst="rect"/>
                         </pic:spPr>
@@ -1305,7 +1281,7 @@
         <w:rPr>
           <w:rFonts w:ascii="Microsoft YaHei" w:hAnsi="Microsoft YaHei"/>
           <w:color w:val="0066CC"/>
-          <w:sz w:val="36"/>
+          <w:sz w:val="32"/>
         </w:rPr>
         <w:t>六、报表管理</w:t>
       </w:r>
@@ -1315,11 +1291,25 @@
         <w:rPr>
           <w:rFonts w:ascii="Microsoft YaHei" w:hAnsi="Microsoft YaHei"/>
           <w:i/>
-          <w:sz w:val="22"/>
+          <w:color w:val="646464"/>
+          <w:sz w:val="20"/>
         </w:rPr>
         <w:t>提供各类运营报表，包括票务核销报表、教学核销报表、教学数据看板等</w:t>
       </w:r>
     </w:p>
+    <w:p/>
+    <w:p>
+      <w:r>
+        <w:rPr>
+          <w:rFonts w:ascii="Microsoft YaHei" w:hAnsi="Microsoft YaHei"/>
+          <w:i/>
+          <w:color w:val="969696"/>
+          <w:sz w:val="20"/>
+        </w:rPr>
+        <w:t>（该模块功能截图需要特定权限才能访问）</w:t>
+      </w:r>
+    </w:p>
+    <w:p/>
     <w:p>
       <w:pPr>
         <w:pStyle w:val="Heading1"/>
@@ -1328,7 +1318,7 @@
         <w:rPr>
           <w:rFonts w:ascii="Microsoft YaHei" w:hAnsi="Microsoft YaHei"/>
           <w:color w:val="0066CC"/>
-          <w:sz w:val="36"/>
+          <w:sz w:val="32"/>
         </w:rPr>
         <w:t>七、系统管理</w:t>
       </w:r>
@@ -1338,42 +1328,62 @@
         <w:rPr>
           <w:rFonts w:ascii="Microsoft YaHei" w:hAnsi="Microsoft YaHei"/>
           <w:i/>
-          <w:sz w:val="22"/>
+          <w:color w:val="646464"/>
+          <w:sz w:val="20"/>
         </w:rPr>
         <w:t>系统基础功能的设置，包括文件，身份标识，日志及相关系统参数的设置</w:t>
       </w:r>
     </w:p>
+    <w:p/>
     <w:tbl>
       <w:tblPr>
         <w:tblStyle w:val="LightGrid-Accent1"/>
         <w:tblW w:type="auto" w:w="0"/>
+        <w:jc w:val="center"/>
         <w:tblLook w:firstColumn="1" w:firstRow="1" w:lastColumn="0" w:lastRow="0" w:noHBand="0" w:noVBand="1" w:val="04A0"/>
       </w:tblPr>
       <w:tblGrid>
-        <w:gridCol w:w="8640"/>
+        <w:gridCol w:w="2268"/>
+        <w:gridCol w:w="7370"/>
       </w:tblGrid>
       <w:tr>
         <w:tc>
           <w:tcPr>
-            <w:tcW w:type="dxa" w:w="8640"/>
+            <w:tcW w:type="dxa" w:w="4986"/>
+            <w:shd w:fill="4472C4"/>
           </w:tcPr>
           <w:p>
+            <w:pPr>
+              <w:jc w:val="center"/>
+            </w:pPr>
             <w:r>
               <w:rPr>
                 <w:rFonts w:ascii="Microsoft YaHei" w:hAnsi="Microsoft YaHei"/>
                 <w:b/>
-                <w:color w:val="000000"/>
+                <w:color w:val="FFFFFF"/>
                 <w:sz w:val="24"/>
               </w:rPr>
-              <w:t>文件管理</w:t>
+              <w:t>功能</w:t>
             </w:r>
+          </w:p>
+        </w:tc>
+        <w:tc>
+          <w:tcPr>
+            <w:tcW w:type="dxa" w:w="4986"/>
+            <w:shd w:fill="4472C4"/>
+          </w:tcPr>
+          <w:p>
+            <w:pPr>
+              <w:jc w:val="center"/>
+            </w:pPr>
             <w:r>
               <w:rPr>
                 <w:rFonts w:ascii="Microsoft YaHei" w:hAnsi="Microsoft YaHei"/>
-                <w:color w:val="404040"/>
-                <w:sz w:val="22"/>
+                <w:b/>
+                <w:color w:val="FFFFFF"/>
+                <w:sz w:val="24"/>
               </w:rPr>
-              <w:t xml:space="preserve"> - 系统管理-文件管理</w:t>
+              <w:t>功能截图</w:t>
             </w:r>
           </w:p>
         </w:tc>
@@ -1381,17 +1391,36 @@
       <w:tr>
         <w:tc>
           <w:tcPr>
-            <w:tcW w:type="dxa" w:w="8640"/>
+            <w:tcW w:type="dxa" w:w="4986"/>
           </w:tcPr>
           <w:p>
             <w:pPr>
               <w:jc w:val="center"/>
             </w:pPr>
             <w:r>
+              <w:rPr>
+                <w:rFonts w:ascii="Microsoft YaHei" w:hAnsi="Microsoft YaHei"/>
+                <w:b/>
+                <w:sz w:val="22"/>
+              </w:rPr>
+              <w:t>文件管理</w:t>
+            </w:r>
+          </w:p>
+        </w:tc>
+        <w:tc>
+          <w:tcPr>
+            <w:tcW w:type="dxa" w:w="4986"/>
+          </w:tcPr>
+          <w:p>
+            <w:pPr>
+              <w:jc w:val="center"/>
+            </w:pPr>
+            <w:r/>
+            <w:r>
               <w:drawing>
                 <wp:inline xmlns:a="http://schemas.openxmlformats.org/drawingml/2006/main" xmlns:pic="http://schemas.openxmlformats.org/drawingml/2006/picture">
-                  <wp:extent cx="5486400" cy="3086100"/>
-                  <wp:docPr id="15" name="Picture 15"/>
+                  <wp:extent cx="4320000" cy="2430000"/>
+                  <wp:docPr id="14" name="Picture 14"/>
                   <wp:cNvGraphicFramePr>
                     <a:graphicFrameLocks noChangeAspect="1"/>
                   </wp:cNvGraphicFramePr>
@@ -1411,7 +1440,7 @@
                         <pic:spPr>
                           <a:xfrm>
                             <a:off x="0" y="0"/>
-                            <a:ext cx="5486400" cy="3086100"/>
+                            <a:ext cx="4320000" cy="2430000"/>
                           </a:xfrm>
                           <a:prstGeom prst="rect"/>
                         </pic:spPr>
@@ -1424,57 +1453,39 @@
           </w:p>
         </w:tc>
       </w:tr>
-    </w:tbl>
-    <w:p/>
-    <w:tbl>
-      <w:tblPr>
-        <w:tblStyle w:val="LightGrid-Accent1"/>
-        <w:tblW w:type="auto" w:w="0"/>
-        <w:tblLook w:firstColumn="1" w:firstRow="1" w:lastColumn="0" w:lastRow="0" w:noHBand="0" w:noVBand="1" w:val="04A0"/>
-      </w:tblPr>
-      <w:tblGrid>
-        <w:gridCol w:w="8640"/>
-      </w:tblGrid>
       <w:tr>
         <w:tc>
           <w:tcPr>
-            <w:tcW w:type="dxa" w:w="8640"/>
-          </w:tcPr>
-          <w:p>
-            <w:r>
-              <w:rPr>
-                <w:rFonts w:ascii="Microsoft YaHei" w:hAnsi="Microsoft YaHei"/>
-                <w:b/>
-                <w:color w:val="000000"/>
-                <w:sz w:val="24"/>
-              </w:rPr>
-              <w:t>组织机构</w:t>
-            </w:r>
-            <w:r>
-              <w:rPr>
-                <w:rFonts w:ascii="Microsoft YaHei" w:hAnsi="Microsoft YaHei"/>
-                <w:color w:val="404040"/>
-                <w:sz w:val="22"/>
-              </w:rPr>
-              <w:t xml:space="preserve"> - 系统管理-组织机构</w:t>
-            </w:r>
-          </w:p>
-        </w:tc>
-      </w:tr>
-      <w:tr>
-        <w:tc>
-          <w:tcPr>
-            <w:tcW w:type="dxa" w:w="8640"/>
+            <w:tcW w:type="dxa" w:w="4986"/>
           </w:tcPr>
           <w:p>
             <w:pPr>
               <w:jc w:val="center"/>
             </w:pPr>
             <w:r>
+              <w:rPr>
+                <w:rFonts w:ascii="Microsoft YaHei" w:hAnsi="Microsoft YaHei"/>
+                <w:b/>
+                <w:sz w:val="22"/>
+              </w:rPr>
+              <w:t>组织机构</w:t>
+            </w:r>
+          </w:p>
+        </w:tc>
+        <w:tc>
+          <w:tcPr>
+            <w:tcW w:type="dxa" w:w="4986"/>
+          </w:tcPr>
+          <w:p>
+            <w:pPr>
+              <w:jc w:val="center"/>
+            </w:pPr>
+            <w:r/>
+            <w:r>
               <w:drawing>
                 <wp:inline xmlns:a="http://schemas.openxmlformats.org/drawingml/2006/main" xmlns:pic="http://schemas.openxmlformats.org/drawingml/2006/picture">
-                  <wp:extent cx="5486400" cy="3086100"/>
-                  <wp:docPr id="16" name="Picture 16"/>
+                  <wp:extent cx="4320000" cy="2430000"/>
+                  <wp:docPr id="15" name="Picture 15"/>
                   <wp:cNvGraphicFramePr>
                     <a:graphicFrameLocks noChangeAspect="1"/>
                   </wp:cNvGraphicFramePr>
@@ -1494,7 +1505,7 @@
                         <pic:spPr>
                           <a:xfrm>
                             <a:off x="0" y="0"/>
-                            <a:ext cx="5486400" cy="3086100"/>
+                            <a:ext cx="4320000" cy="2430000"/>
                           </a:xfrm>
                           <a:prstGeom prst="rect"/>
                         </pic:spPr>
@@ -1507,57 +1518,39 @@
           </w:p>
         </w:tc>
       </w:tr>
-    </w:tbl>
-    <w:p/>
-    <w:tbl>
-      <w:tblPr>
-        <w:tblStyle w:val="LightGrid-Accent1"/>
-        <w:tblW w:type="auto" w:w="0"/>
-        <w:tblLook w:firstColumn="1" w:firstRow="1" w:lastColumn="0" w:lastRow="0" w:noHBand="0" w:noVBand="1" w:val="04A0"/>
-      </w:tblPr>
-      <w:tblGrid>
-        <w:gridCol w:w="8640"/>
-      </w:tblGrid>
       <w:tr>
         <w:tc>
           <w:tcPr>
-            <w:tcW w:type="dxa" w:w="8640"/>
-          </w:tcPr>
-          <w:p>
-            <w:r>
-              <w:rPr>
-                <w:rFonts w:ascii="Microsoft YaHei" w:hAnsi="Microsoft YaHei"/>
-                <w:b/>
-                <w:color w:val="000000"/>
-                <w:sz w:val="24"/>
-              </w:rPr>
-              <w:t>角色管理</w:t>
-            </w:r>
-            <w:r>
-              <w:rPr>
-                <w:rFonts w:ascii="Microsoft YaHei" w:hAnsi="Microsoft YaHei"/>
-                <w:color w:val="404040"/>
-                <w:sz w:val="22"/>
-              </w:rPr>
-              <w:t xml:space="preserve"> - 系统管理-角色管理</w:t>
-            </w:r>
-          </w:p>
-        </w:tc>
-      </w:tr>
-      <w:tr>
-        <w:tc>
-          <w:tcPr>
-            <w:tcW w:type="dxa" w:w="8640"/>
+            <w:tcW w:type="dxa" w:w="4986"/>
           </w:tcPr>
           <w:p>
             <w:pPr>
               <w:jc w:val="center"/>
             </w:pPr>
             <w:r>
+              <w:rPr>
+                <w:rFonts w:ascii="Microsoft YaHei" w:hAnsi="Microsoft YaHei"/>
+                <w:b/>
+                <w:sz w:val="22"/>
+              </w:rPr>
+              <w:t>角色管理</w:t>
+            </w:r>
+          </w:p>
+        </w:tc>
+        <w:tc>
+          <w:tcPr>
+            <w:tcW w:type="dxa" w:w="4986"/>
+          </w:tcPr>
+          <w:p>
+            <w:pPr>
+              <w:jc w:val="center"/>
+            </w:pPr>
+            <w:r/>
+            <w:r>
               <w:drawing>
                 <wp:inline xmlns:a="http://schemas.openxmlformats.org/drawingml/2006/main" xmlns:pic="http://schemas.openxmlformats.org/drawingml/2006/picture">
-                  <wp:extent cx="5486400" cy="3086100"/>
-                  <wp:docPr id="17" name="Picture 17"/>
+                  <wp:extent cx="4320000" cy="2430000"/>
+                  <wp:docPr id="16" name="Picture 16"/>
                   <wp:cNvGraphicFramePr>
                     <a:graphicFrameLocks noChangeAspect="1"/>
                   </wp:cNvGraphicFramePr>
@@ -1577,7 +1570,7 @@
                         <pic:spPr>
                           <a:xfrm>
                             <a:off x="0" y="0"/>
-                            <a:ext cx="5486400" cy="3086100"/>
+                            <a:ext cx="4320000" cy="2430000"/>
                           </a:xfrm>
                           <a:prstGeom prst="rect"/>
                         </pic:spPr>
@@ -1590,57 +1583,39 @@
           </w:p>
         </w:tc>
       </w:tr>
-    </w:tbl>
-    <w:p/>
-    <w:tbl>
-      <w:tblPr>
-        <w:tblStyle w:val="LightGrid-Accent1"/>
-        <w:tblW w:type="auto" w:w="0"/>
-        <w:tblLook w:firstColumn="1" w:firstRow="1" w:lastColumn="0" w:lastRow="0" w:noHBand="0" w:noVBand="1" w:val="04A0"/>
-      </w:tblPr>
-      <w:tblGrid>
-        <w:gridCol w:w="8640"/>
-      </w:tblGrid>
       <w:tr>
         <w:tc>
           <w:tcPr>
-            <w:tcW w:type="dxa" w:w="8640"/>
-          </w:tcPr>
-          <w:p>
-            <w:r>
-              <w:rPr>
-                <w:rFonts w:ascii="Microsoft YaHei" w:hAnsi="Microsoft YaHei"/>
-                <w:b/>
-                <w:color w:val="000000"/>
-                <w:sz w:val="24"/>
-              </w:rPr>
-              <w:t>用户管理</w:t>
-            </w:r>
-            <w:r>
-              <w:rPr>
-                <w:rFonts w:ascii="Microsoft YaHei" w:hAnsi="Microsoft YaHei"/>
-                <w:color w:val="404040"/>
-                <w:sz w:val="22"/>
-              </w:rPr>
-              <w:t xml:space="preserve"> - 系统管理-用户管理</w:t>
-            </w:r>
-          </w:p>
-        </w:tc>
-      </w:tr>
-      <w:tr>
-        <w:tc>
-          <w:tcPr>
-            <w:tcW w:type="dxa" w:w="8640"/>
+            <w:tcW w:type="dxa" w:w="4986"/>
           </w:tcPr>
           <w:p>
             <w:pPr>
               <w:jc w:val="center"/>
             </w:pPr>
             <w:r>
+              <w:rPr>
+                <w:rFonts w:ascii="Microsoft YaHei" w:hAnsi="Microsoft YaHei"/>
+                <w:b/>
+                <w:sz w:val="22"/>
+              </w:rPr>
+              <w:t>用户管理</w:t>
+            </w:r>
+          </w:p>
+        </w:tc>
+        <w:tc>
+          <w:tcPr>
+            <w:tcW w:type="dxa" w:w="4986"/>
+          </w:tcPr>
+          <w:p>
+            <w:pPr>
+              <w:jc w:val="center"/>
+            </w:pPr>
+            <w:r/>
+            <w:r>
               <w:drawing>
                 <wp:inline xmlns:a="http://schemas.openxmlformats.org/drawingml/2006/main" xmlns:pic="http://schemas.openxmlformats.org/drawingml/2006/picture">
-                  <wp:extent cx="5486400" cy="3086100"/>
-                  <wp:docPr id="18" name="Picture 18"/>
+                  <wp:extent cx="4320000" cy="2430000"/>
+                  <wp:docPr id="17" name="Picture 17"/>
                   <wp:cNvGraphicFramePr>
                     <a:graphicFrameLocks noChangeAspect="1"/>
                   </wp:cNvGraphicFramePr>
@@ -1660,7 +1635,7 @@
                         <pic:spPr>
                           <a:xfrm>
                             <a:off x="0" y="0"/>
-                            <a:ext cx="5486400" cy="3086100"/>
+                            <a:ext cx="4320000" cy="2430000"/>
                           </a:xfrm>
                           <a:prstGeom prst="rect"/>
                         </pic:spPr>
@@ -1673,57 +1648,39 @@
           </w:p>
         </w:tc>
       </w:tr>
-    </w:tbl>
-    <w:p/>
-    <w:tbl>
-      <w:tblPr>
-        <w:tblStyle w:val="LightGrid-Accent1"/>
-        <w:tblW w:type="auto" w:w="0"/>
-        <w:tblLook w:firstColumn="1" w:firstRow="1" w:lastColumn="0" w:lastRow="0" w:noHBand="0" w:noVBand="1" w:val="04A0"/>
-      </w:tblPr>
-      <w:tblGrid>
-        <w:gridCol w:w="8640"/>
-      </w:tblGrid>
       <w:tr>
         <w:tc>
           <w:tcPr>
-            <w:tcW w:type="dxa" w:w="8640"/>
-          </w:tcPr>
-          <w:p>
-            <w:r>
-              <w:rPr>
-                <w:rFonts w:ascii="Microsoft YaHei" w:hAnsi="Microsoft YaHei"/>
-                <w:b/>
-                <w:color w:val="000000"/>
-                <w:sz w:val="24"/>
-              </w:rPr>
-              <w:t>安全日志</w:t>
-            </w:r>
-            <w:r>
-              <w:rPr>
-                <w:rFonts w:ascii="Microsoft YaHei" w:hAnsi="Microsoft YaHei"/>
-                <w:color w:val="404040"/>
-                <w:sz w:val="22"/>
-              </w:rPr>
-              <w:t xml:space="preserve"> - 系统管理-安全日志</w:t>
-            </w:r>
-          </w:p>
-        </w:tc>
-      </w:tr>
-      <w:tr>
-        <w:tc>
-          <w:tcPr>
-            <w:tcW w:type="dxa" w:w="8640"/>
+            <w:tcW w:type="dxa" w:w="4986"/>
           </w:tcPr>
           <w:p>
             <w:pPr>
               <w:jc w:val="center"/>
             </w:pPr>
             <w:r>
+              <w:rPr>
+                <w:rFonts w:ascii="Microsoft YaHei" w:hAnsi="Microsoft YaHei"/>
+                <w:b/>
+                <w:sz w:val="22"/>
+              </w:rPr>
+              <w:t>安全日志</w:t>
+            </w:r>
+          </w:p>
+        </w:tc>
+        <w:tc>
+          <w:tcPr>
+            <w:tcW w:type="dxa" w:w="4986"/>
+          </w:tcPr>
+          <w:p>
+            <w:pPr>
+              <w:jc w:val="center"/>
+            </w:pPr>
+            <w:r/>
+            <w:r>
               <w:drawing>
                 <wp:inline xmlns:a="http://schemas.openxmlformats.org/drawingml/2006/main" xmlns:pic="http://schemas.openxmlformats.org/drawingml/2006/picture">
-                  <wp:extent cx="5486400" cy="3086100"/>
-                  <wp:docPr id="19" name="Picture 19"/>
+                  <wp:extent cx="4320000" cy="2430000"/>
+                  <wp:docPr id="18" name="Picture 18"/>
                   <wp:cNvGraphicFramePr>
                     <a:graphicFrameLocks noChangeAspect="1"/>
                   </wp:cNvGraphicFramePr>
@@ -1743,7 +1700,7 @@
                         <pic:spPr>
                           <a:xfrm>
                             <a:off x="0" y="0"/>
-                            <a:ext cx="5486400" cy="3086100"/>
+                            <a:ext cx="4320000" cy="2430000"/>
                           </a:xfrm>
                           <a:prstGeom prst="rect"/>
                         </pic:spPr>
@@ -1756,57 +1713,39 @@
           </w:p>
         </w:tc>
       </w:tr>
-    </w:tbl>
-    <w:p/>
-    <w:tbl>
-      <w:tblPr>
-        <w:tblStyle w:val="LightGrid-Accent1"/>
-        <w:tblW w:type="auto" w:w="0"/>
-        <w:tblLook w:firstColumn="1" w:firstRow="1" w:lastColumn="0" w:lastRow="0" w:noHBand="0" w:noVBand="1" w:val="04A0"/>
-      </w:tblPr>
-      <w:tblGrid>
-        <w:gridCol w:w="8640"/>
-      </w:tblGrid>
       <w:tr>
         <w:tc>
           <w:tcPr>
-            <w:tcW w:type="dxa" w:w="8640"/>
-          </w:tcPr>
-          <w:p>
-            <w:r>
-              <w:rPr>
-                <w:rFonts w:ascii="Microsoft YaHei" w:hAnsi="Microsoft YaHei"/>
-                <w:b/>
-                <w:color w:val="000000"/>
-                <w:sz w:val="24"/>
-              </w:rPr>
-              <w:t>系统设置</w:t>
-            </w:r>
-            <w:r>
-              <w:rPr>
-                <w:rFonts w:ascii="Microsoft YaHei" w:hAnsi="Microsoft YaHei"/>
-                <w:color w:val="404040"/>
-                <w:sz w:val="22"/>
-              </w:rPr>
-              <w:t xml:space="preserve"> - 系统管理-系统设置</w:t>
-            </w:r>
-          </w:p>
-        </w:tc>
-      </w:tr>
-      <w:tr>
-        <w:tc>
-          <w:tcPr>
-            <w:tcW w:type="dxa" w:w="8640"/>
+            <w:tcW w:type="dxa" w:w="4986"/>
           </w:tcPr>
           <w:p>
             <w:pPr>
               <w:jc w:val="center"/>
             </w:pPr>
             <w:r>
+              <w:rPr>
+                <w:rFonts w:ascii="Microsoft YaHei" w:hAnsi="Microsoft YaHei"/>
+                <w:b/>
+                <w:sz w:val="22"/>
+              </w:rPr>
+              <w:t>系统设置</w:t>
+            </w:r>
+          </w:p>
+        </w:tc>
+        <w:tc>
+          <w:tcPr>
+            <w:tcW w:type="dxa" w:w="4986"/>
+          </w:tcPr>
+          <w:p>
+            <w:pPr>
+              <w:jc w:val="center"/>
+            </w:pPr>
+            <w:r/>
+            <w:r>
               <w:drawing>
                 <wp:inline xmlns:a="http://schemas.openxmlformats.org/drawingml/2006/main" xmlns:pic="http://schemas.openxmlformats.org/drawingml/2006/picture">
-                  <wp:extent cx="5486400" cy="3086100"/>
-                  <wp:docPr id="20" name="Picture 20"/>
+                  <wp:extent cx="4320000" cy="2430000"/>
+                  <wp:docPr id="19" name="Picture 19"/>
                   <wp:cNvGraphicFramePr>
                     <a:graphicFrameLocks noChangeAspect="1"/>
                   </wp:cNvGraphicFramePr>
@@ -1826,7 +1765,7 @@
                         <pic:spPr>
                           <a:xfrm>
                             <a:off x="0" y="0"/>
-                            <a:ext cx="5486400" cy="3086100"/>
+                            <a:ext cx="4320000" cy="2430000"/>
                           </a:xfrm>
                           <a:prstGeom prst="rect"/>
                         </pic:spPr>
@@ -1843,7 +1782,7 @@
     <w:p/>
     <w:sectPr>
       <w:pgSz w:w="12240" w:h="15840"/>
-      <w:pgMar w:top="1440" w:right="1800" w:bottom="1440" w:left="1800" w:header="720" w:footer="720" w:gutter="0"/>
+      <w:pgMar w:top="1134" w:right="1134" w:bottom="1134" w:left="1134" w:header="720" w:footer="720" w:gutter="0"/>
       <w:cols w:space="720"/>
       <w:docGrid w:linePitch="360"/>
     </w:sectPr>

</xml_diff>

<commit_message>
Refactor: Consolidate screenshot scripts and update menu data
Remove redundant scripts and merge functionality. Update menu data with new entries.

Co-authored-by: chentianran <chentianran@shengdaxun.com>
</commit_message>
<xml_diff>
--- a/票务系统功能截图对照文档.docx
+++ b/票务系统功能截图对照文档.docx
@@ -24,7 +24,7 @@
           <w:color w:val="646464"/>
           <w:sz w:val="22"/>
         </w:rPr>
-        <w:t>本文档展示票务系统各功能模块的界面截图。</w:t>
+        <w:t>本文档展示票务系统各功能模块的界面截图。表格形式展示：左列为功能名称，右列为对应截图。</w:t>
       </w:r>
     </w:p>
     <w:p/>
@@ -186,7 +186,7 @@
                 <w:b/>
                 <w:sz w:val="22"/>
               </w:rPr>
-              <w:t>电子券列表</w:t>
+              <w:t>票务管理-电子券列表</w:t>
             </w:r>
           </w:p>
         </w:tc>
@@ -251,7 +251,7 @@
                 <w:b/>
                 <w:sz w:val="22"/>
               </w:rPr>
-              <w:t>电子票初始化</w:t>
+              <w:t>票务管理-电子票初始化</w:t>
             </w:r>
           </w:p>
         </w:tc>
@@ -316,7 +316,7 @@
                 <w:b/>
                 <w:sz w:val="22"/>
               </w:rPr>
-              <w:t>纸制票模板</w:t>
+              <w:t>票务管理-纸制票模板</w:t>
             </w:r>
           </w:p>
         </w:tc>
@@ -346,6 +346,331 @@
                         </pic:nvPicPr>
                         <pic:blipFill>
                           <a:blip r:embed="rId12"/>
+                          <a:stretch>
+                            <a:fillRect/>
+                          </a:stretch>
+                        </pic:blipFill>
+                        <pic:spPr>
+                          <a:xfrm>
+                            <a:off x="0" y="0"/>
+                            <a:ext cx="4320000" cy="2430000"/>
+                          </a:xfrm>
+                          <a:prstGeom prst="rect"/>
+                        </pic:spPr>
+                      </pic:pic>
+                    </a:graphicData>
+                  </a:graphic>
+                </wp:inline>
+              </w:drawing>
+            </w:r>
+          </w:p>
+        </w:tc>
+      </w:tr>
+      <w:tr>
+        <w:tc>
+          <w:tcPr>
+            <w:tcW w:type="dxa" w:w="4986"/>
+          </w:tcPr>
+          <w:p>
+            <w:pPr>
+              <w:jc w:val="center"/>
+            </w:pPr>
+            <w:r>
+              <w:rPr>
+                <w:rFonts w:ascii="Microsoft YaHei" w:hAnsi="Microsoft YaHei"/>
+                <w:b/>
+                <w:sz w:val="22"/>
+              </w:rPr>
+              <w:t>产品管理</w:t>
+            </w:r>
+          </w:p>
+        </w:tc>
+        <w:tc>
+          <w:tcPr>
+            <w:tcW w:type="dxa" w:w="4986"/>
+          </w:tcPr>
+          <w:p>
+            <w:pPr>
+              <w:jc w:val="center"/>
+            </w:pPr>
+            <w:r/>
+            <w:r>
+              <w:drawing>
+                <wp:inline xmlns:a="http://schemas.openxmlformats.org/drawingml/2006/main" xmlns:pic="http://schemas.openxmlformats.org/drawingml/2006/picture">
+                  <wp:extent cx="4320000" cy="2430000"/>
+                  <wp:docPr id="5" name="Picture 5"/>
+                  <wp:cNvGraphicFramePr>
+                    <a:graphicFrameLocks noChangeAspect="1"/>
+                  </wp:cNvGraphicFramePr>
+                  <a:graphic>
+                    <a:graphicData uri="http://schemas.openxmlformats.org/drawingml/2006/picture">
+                      <pic:pic>
+                        <pic:nvPicPr>
+                          <pic:cNvPr id="0" name="019_控制面板-产品管理.png"/>
+                          <pic:cNvPicPr/>
+                        </pic:nvPicPr>
+                        <pic:blipFill>
+                          <a:blip r:embed="rId13"/>
+                          <a:stretch>
+                            <a:fillRect/>
+                          </a:stretch>
+                        </pic:blipFill>
+                        <pic:spPr>
+                          <a:xfrm>
+                            <a:off x="0" y="0"/>
+                            <a:ext cx="4320000" cy="2430000"/>
+                          </a:xfrm>
+                          <a:prstGeom prst="rect"/>
+                        </pic:spPr>
+                      </pic:pic>
+                    </a:graphicData>
+                  </a:graphic>
+                </wp:inline>
+              </w:drawing>
+            </w:r>
+          </w:p>
+        </w:tc>
+      </w:tr>
+      <w:tr>
+        <w:tc>
+          <w:tcPr>
+            <w:tcW w:type="dxa" w:w="4986"/>
+          </w:tcPr>
+          <w:p>
+            <w:pPr>
+              <w:jc w:val="center"/>
+            </w:pPr>
+            <w:r>
+              <w:rPr>
+                <w:rFonts w:ascii="Microsoft YaHei" w:hAnsi="Microsoft YaHei"/>
+                <w:b/>
+                <w:sz w:val="22"/>
+              </w:rPr>
+              <w:t>产品分类</w:t>
+            </w:r>
+          </w:p>
+        </w:tc>
+        <w:tc>
+          <w:tcPr>
+            <w:tcW w:type="dxa" w:w="4986"/>
+          </w:tcPr>
+          <w:p>
+            <w:pPr>
+              <w:jc w:val="center"/>
+            </w:pPr>
+            <w:r/>
+            <w:r>
+              <w:drawing>
+                <wp:inline xmlns:a="http://schemas.openxmlformats.org/drawingml/2006/main" xmlns:pic="http://schemas.openxmlformats.org/drawingml/2006/picture">
+                  <wp:extent cx="4320000" cy="2430000"/>
+                  <wp:docPr id="6" name="Picture 6"/>
+                  <wp:cNvGraphicFramePr>
+                    <a:graphicFrameLocks noChangeAspect="1"/>
+                  </wp:cNvGraphicFramePr>
+                  <a:graphic>
+                    <a:graphicData uri="http://schemas.openxmlformats.org/drawingml/2006/picture">
+                      <pic:pic>
+                        <pic:nvPicPr>
+                          <pic:cNvPr id="0" name="020_控制面板-产品分类.png"/>
+                          <pic:cNvPicPr/>
+                        </pic:nvPicPr>
+                        <pic:blipFill>
+                          <a:blip r:embed="rId14"/>
+                          <a:stretch>
+                            <a:fillRect/>
+                          </a:stretch>
+                        </pic:blipFill>
+                        <pic:spPr>
+                          <a:xfrm>
+                            <a:off x="0" y="0"/>
+                            <a:ext cx="4320000" cy="2430000"/>
+                          </a:xfrm>
+                          <a:prstGeom prst="rect"/>
+                        </pic:spPr>
+                      </pic:pic>
+                    </a:graphicData>
+                  </a:graphic>
+                </wp:inline>
+              </w:drawing>
+            </w:r>
+          </w:p>
+        </w:tc>
+      </w:tr>
+      <w:tr>
+        <w:tc>
+          <w:tcPr>
+            <w:tcW w:type="dxa" w:w="4986"/>
+          </w:tcPr>
+          <w:p>
+            <w:pPr>
+              <w:jc w:val="center"/>
+            </w:pPr>
+            <w:r>
+              <w:rPr>
+                <w:rFonts w:ascii="Microsoft YaHei" w:hAnsi="Microsoft YaHei"/>
+                <w:b/>
+                <w:sz w:val="22"/>
+              </w:rPr>
+              <w:t>产品-产品管理</w:t>
+            </w:r>
+          </w:p>
+        </w:tc>
+        <w:tc>
+          <w:tcPr>
+            <w:tcW w:type="dxa" w:w="4986"/>
+          </w:tcPr>
+          <w:p>
+            <w:pPr>
+              <w:jc w:val="center"/>
+            </w:pPr>
+            <w:r/>
+            <w:r>
+              <w:drawing>
+                <wp:inline xmlns:a="http://schemas.openxmlformats.org/drawingml/2006/main" xmlns:pic="http://schemas.openxmlformats.org/drawingml/2006/picture">
+                  <wp:extent cx="4320000" cy="2430000"/>
+                  <wp:docPr id="7" name="Picture 7"/>
+                  <wp:cNvGraphicFramePr>
+                    <a:graphicFrameLocks noChangeAspect="1"/>
+                  </wp:cNvGraphicFramePr>
+                  <a:graphic>
+                    <a:graphicData uri="http://schemas.openxmlformats.org/drawingml/2006/picture">
+                      <pic:pic>
+                        <pic:nvPicPr>
+                          <pic:cNvPr id="0" name="019_控制面板-产品管理.png"/>
+                          <pic:cNvPicPr/>
+                        </pic:nvPicPr>
+                        <pic:blipFill>
+                          <a:blip r:embed="rId13"/>
+                          <a:stretch>
+                            <a:fillRect/>
+                          </a:stretch>
+                        </pic:blipFill>
+                        <pic:spPr>
+                          <a:xfrm>
+                            <a:off x="0" y="0"/>
+                            <a:ext cx="4320000" cy="2430000"/>
+                          </a:xfrm>
+                          <a:prstGeom prst="rect"/>
+                        </pic:spPr>
+                      </pic:pic>
+                    </a:graphicData>
+                  </a:graphic>
+                </wp:inline>
+              </w:drawing>
+            </w:r>
+          </w:p>
+        </w:tc>
+      </w:tr>
+      <w:tr>
+        <w:tc>
+          <w:tcPr>
+            <w:tcW w:type="dxa" w:w="4986"/>
+          </w:tcPr>
+          <w:p>
+            <w:pPr>
+              <w:jc w:val="center"/>
+            </w:pPr>
+            <w:r>
+              <w:rPr>
+                <w:rFonts w:ascii="Microsoft YaHei" w:hAnsi="Microsoft YaHei"/>
+                <w:b/>
+                <w:sz w:val="22"/>
+              </w:rPr>
+              <w:t>产品-产品分类</w:t>
+            </w:r>
+          </w:p>
+        </w:tc>
+        <w:tc>
+          <w:tcPr>
+            <w:tcW w:type="dxa" w:w="4986"/>
+          </w:tcPr>
+          <w:p>
+            <w:pPr>
+              <w:jc w:val="center"/>
+            </w:pPr>
+            <w:r/>
+            <w:r>
+              <w:drawing>
+                <wp:inline xmlns:a="http://schemas.openxmlformats.org/drawingml/2006/main" xmlns:pic="http://schemas.openxmlformats.org/drawingml/2006/picture">
+                  <wp:extent cx="4320000" cy="2430000"/>
+                  <wp:docPr id="8" name="Picture 8"/>
+                  <wp:cNvGraphicFramePr>
+                    <a:graphicFrameLocks noChangeAspect="1"/>
+                  </wp:cNvGraphicFramePr>
+                  <a:graphic>
+                    <a:graphicData uri="http://schemas.openxmlformats.org/drawingml/2006/picture">
+                      <pic:pic>
+                        <pic:nvPicPr>
+                          <pic:cNvPr id="0" name="020_控制面板-产品分类.png"/>
+                          <pic:cNvPicPr/>
+                        </pic:nvPicPr>
+                        <pic:blipFill>
+                          <a:blip r:embed="rId14"/>
+                          <a:stretch>
+                            <a:fillRect/>
+                          </a:stretch>
+                        </pic:blipFill>
+                        <pic:spPr>
+                          <a:xfrm>
+                            <a:off x="0" y="0"/>
+                            <a:ext cx="4320000" cy="2430000"/>
+                          </a:xfrm>
+                          <a:prstGeom prst="rect"/>
+                        </pic:spPr>
+                      </pic:pic>
+                    </a:graphicData>
+                  </a:graphic>
+                </wp:inline>
+              </w:drawing>
+            </w:r>
+          </w:p>
+        </w:tc>
+      </w:tr>
+      <w:tr>
+        <w:tc>
+          <w:tcPr>
+            <w:tcW w:type="dxa" w:w="4986"/>
+          </w:tcPr>
+          <w:p>
+            <w:pPr>
+              <w:jc w:val="center"/>
+            </w:pPr>
+            <w:r>
+              <w:rPr>
+                <w:rFonts w:ascii="Microsoft YaHei" w:hAnsi="Microsoft YaHei"/>
+                <w:b/>
+                <w:sz w:val="22"/>
+              </w:rPr>
+              <w:t>票务核销报表</w:t>
+            </w:r>
+          </w:p>
+        </w:tc>
+        <w:tc>
+          <w:tcPr>
+            <w:tcW w:type="dxa" w:w="4986"/>
+          </w:tcPr>
+          <w:p>
+            <w:pPr>
+              <w:jc w:val="center"/>
+            </w:pPr>
+            <w:r/>
+            <w:r>
+              <w:drawing>
+                <wp:inline xmlns:a="http://schemas.openxmlformats.org/drawingml/2006/main" xmlns:pic="http://schemas.openxmlformats.org/drawingml/2006/picture">
+                  <wp:extent cx="4320000" cy="2430000"/>
+                  <wp:docPr id="9" name="Picture 9"/>
+                  <wp:cNvGraphicFramePr>
+                    <a:graphicFrameLocks noChangeAspect="1"/>
+                  </wp:cNvGraphicFramePr>
+                  <a:graphic>
+                    <a:graphicData uri="http://schemas.openxmlformats.org/drawingml/2006/picture">
+                      <pic:pic>
+                        <pic:nvPicPr>
+                          <pic:cNvPr id="0" name="048_报表-票务核销报表.png"/>
+                          <pic:cNvPicPr/>
+                        </pic:nvPicPr>
+                        <pic:blipFill>
+                          <a:blip r:embed="rId15"/>
                           <a:stretch>
                             <a:fillRect/>
                           </a:stretch>
@@ -478,7 +803,7 @@
               <w:drawing>
                 <wp:inline xmlns:a="http://schemas.openxmlformats.org/drawingml/2006/main" xmlns:pic="http://schemas.openxmlformats.org/drawingml/2006/picture">
                   <wp:extent cx="4320000" cy="2430000"/>
-                  <wp:docPr id="5" name="Picture 5"/>
+                  <wp:docPr id="10" name="Picture 10"/>
                   <wp:cNvGraphicFramePr>
                     <a:graphicFrameLocks noChangeAspect="1"/>
                   </wp:cNvGraphicFramePr>
@@ -490,7 +815,7 @@
                           <pic:cNvPicPr/>
                         </pic:nvPicPr>
                         <pic:blipFill>
-                          <a:blip r:embed="rId13"/>
+                          <a:blip r:embed="rId16"/>
                           <a:stretch>
                             <a:fillRect/>
                           </a:stretch>
@@ -523,7 +848,7 @@
           <w:color w:val="0066CC"/>
           <w:sz w:val="32"/>
         </w:rPr>
-        <w:t>三、工作台</w:t>
+        <w:t>三、工作台管理</w:t>
       </w:r>
     </w:p>
     <w:p>
@@ -623,7 +948,7 @@
               <w:drawing>
                 <wp:inline xmlns:a="http://schemas.openxmlformats.org/drawingml/2006/main" xmlns:pic="http://schemas.openxmlformats.org/drawingml/2006/picture">
                   <wp:extent cx="4320000" cy="2430000"/>
-                  <wp:docPr id="6" name="Picture 6"/>
+                  <wp:docPr id="11" name="Picture 11"/>
                   <wp:cNvGraphicFramePr>
                     <a:graphicFrameLocks noChangeAspect="1"/>
                   </wp:cNvGraphicFramePr>
@@ -635,7 +960,7 @@
                           <pic:cNvPicPr/>
                         </pic:nvPicPr>
                         <pic:blipFill>
-                          <a:blip r:embed="rId14"/>
+                          <a:blip r:embed="rId17"/>
                           <a:stretch>
                             <a:fillRect/>
                           </a:stretch>
@@ -688,7 +1013,7 @@
               <w:drawing>
                 <wp:inline xmlns:a="http://schemas.openxmlformats.org/drawingml/2006/main" xmlns:pic="http://schemas.openxmlformats.org/drawingml/2006/picture">
                   <wp:extent cx="4320000" cy="2430000"/>
-                  <wp:docPr id="7" name="Picture 7"/>
+                  <wp:docPr id="12" name="Picture 12"/>
                   <wp:cNvGraphicFramePr>
                     <a:graphicFrameLocks noChangeAspect="1"/>
                   </wp:cNvGraphicFramePr>
@@ -700,7 +1025,7 @@
                           <pic:cNvPicPr/>
                         </pic:nvPicPr>
                         <pic:blipFill>
-                          <a:blip r:embed="rId15"/>
+                          <a:blip r:embed="rId18"/>
                           <a:stretch>
                             <a:fillRect/>
                           </a:stretch>
@@ -753,7 +1078,7 @@
               <w:drawing>
                 <wp:inline xmlns:a="http://schemas.openxmlformats.org/drawingml/2006/main" xmlns:pic="http://schemas.openxmlformats.org/drawingml/2006/picture">
                   <wp:extent cx="4320000" cy="2430000"/>
-                  <wp:docPr id="8" name="Picture 8"/>
+                  <wp:docPr id="13" name="Picture 13"/>
                   <wp:cNvGraphicFramePr>
                     <a:graphicFrameLocks noChangeAspect="1"/>
                   </wp:cNvGraphicFramePr>
@@ -765,7 +1090,7 @@
                           <pic:cNvPicPr/>
                         </pic:nvPicPr>
                         <pic:blipFill>
-                          <a:blip r:embed="rId16"/>
+                          <a:blip r:embed="rId19"/>
                           <a:stretch>
                             <a:fillRect/>
                           </a:stretch>
@@ -809,7 +1134,7 @@
           <w:color w:val="646464"/>
           <w:sz w:val="20"/>
         </w:rPr>
-        <w:t>通过闸机的管控实现对进出雪场的人员进行管理；通行方式可以是人脸或雪票二维码</w:t>
+        <w:t>通过闸机的管控实现对进出雪场的人员进行管理</w:t>
       </w:r>
     </w:p>
     <w:p/>
@@ -898,7 +1223,7 @@
               <w:drawing>
                 <wp:inline xmlns:a="http://schemas.openxmlformats.org/drawingml/2006/main" xmlns:pic="http://schemas.openxmlformats.org/drawingml/2006/picture">
                   <wp:extent cx="4320000" cy="2430000"/>
-                  <wp:docPr id="9" name="Picture 9"/>
+                  <wp:docPr id="14" name="Picture 14"/>
                   <wp:cNvGraphicFramePr>
                     <a:graphicFrameLocks noChangeAspect="1"/>
                   </wp:cNvGraphicFramePr>
@@ -910,7 +1235,7 @@
                           <pic:cNvPicPr/>
                         </pic:nvPicPr>
                         <pic:blipFill>
-                          <a:blip r:embed="rId17"/>
+                          <a:blip r:embed="rId20"/>
                           <a:stretch>
                             <a:fillRect/>
                           </a:stretch>
@@ -963,7 +1288,7 @@
               <w:drawing>
                 <wp:inline xmlns:a="http://schemas.openxmlformats.org/drawingml/2006/main" xmlns:pic="http://schemas.openxmlformats.org/drawingml/2006/picture">
                   <wp:extent cx="4320000" cy="2430000"/>
-                  <wp:docPr id="10" name="Picture 10"/>
+                  <wp:docPr id="15" name="Picture 15"/>
                   <wp:cNvGraphicFramePr>
                     <a:graphicFrameLocks noChangeAspect="1"/>
                   </wp:cNvGraphicFramePr>
@@ -975,7 +1300,7 @@
                           <pic:cNvPicPr/>
                         </pic:nvPicPr>
                         <pic:blipFill>
-                          <a:blip r:embed="rId18"/>
+                          <a:blip r:embed="rId21"/>
                           <a:stretch>
                             <a:fillRect/>
                           </a:stretch>
@@ -1008,7 +1333,7 @@
           <w:color w:val="0066CC"/>
           <w:sz w:val="32"/>
         </w:rPr>
-        <w:t>五、控制面板</w:t>
+        <w:t>五、控制面板管理</w:t>
       </w:r>
     </w:p>
     <w:p>
@@ -1019,7 +1344,7 @@
           <w:color w:val="646464"/>
           <w:sz w:val="20"/>
         </w:rPr>
-        <w:t>包括对雪票产品设置、电子/纸质票设置、闸机配置、售票小程序、教练、分销商、节假日、租赁物等运营参数的管理</w:t>
+        <w:t>产品设置、闸机配置、教练、分销商、节假日等运营参数管理</w:t>
       </w:r>
     </w:p>
     <w:p/>
@@ -1091,7 +1416,7 @@
                 <w:b/>
                 <w:sz w:val="22"/>
               </w:rPr>
-              <w:t>产品管理</w:t>
+              <w:t>节假日设置</w:t>
             </w:r>
           </w:p>
         </w:tc>
@@ -1108,7 +1433,7 @@
               <w:drawing>
                 <wp:inline xmlns:a="http://schemas.openxmlformats.org/drawingml/2006/main" xmlns:pic="http://schemas.openxmlformats.org/drawingml/2006/picture">
                   <wp:extent cx="4320000" cy="2430000"/>
-                  <wp:docPr id="11" name="Picture 11"/>
+                  <wp:docPr id="16" name="Picture 16"/>
                   <wp:cNvGraphicFramePr>
                     <a:graphicFrameLocks noChangeAspect="1"/>
                   </wp:cNvGraphicFramePr>
@@ -1116,11 +1441,156 @@
                     <a:graphicData uri="http://schemas.openxmlformats.org/drawingml/2006/picture">
                       <pic:pic>
                         <pic:nvPicPr>
-                          <pic:cNvPr id="0" name="019_控制面板-产品管理.png"/>
+                          <pic:cNvPr id="0" name="021_控制面板-节假日设置.png"/>
                           <pic:cNvPicPr/>
                         </pic:nvPicPr>
                         <pic:blipFill>
-                          <a:blip r:embed="rId19"/>
+                          <a:blip r:embed="rId22"/>
+                          <a:stretch>
+                            <a:fillRect/>
+                          </a:stretch>
+                        </pic:blipFill>
+                        <pic:spPr>
+                          <a:xfrm>
+                            <a:off x="0" y="0"/>
+                            <a:ext cx="4320000" cy="2430000"/>
+                          </a:xfrm>
+                          <a:prstGeom prst="rect"/>
+                        </pic:spPr>
+                      </pic:pic>
+                    </a:graphicData>
+                  </a:graphic>
+                </wp:inline>
+              </w:drawing>
+            </w:r>
+          </w:p>
+        </w:tc>
+      </w:tr>
+    </w:tbl>
+    <w:p/>
+    <w:p>
+      <w:pPr>
+        <w:pStyle w:val="Heading1"/>
+      </w:pPr>
+      <w:r>
+        <w:rPr>
+          <w:rFonts w:ascii="Microsoft YaHei" w:hAnsi="Microsoft YaHei"/>
+          <w:color w:val="0066CC"/>
+          <w:sz w:val="32"/>
+        </w:rPr>
+        <w:t>六、租赁管理</w:t>
+      </w:r>
+    </w:p>
+    <w:p>
+      <w:r>
+        <w:rPr>
+          <w:rFonts w:ascii="Microsoft YaHei" w:hAnsi="Microsoft YaHei"/>
+          <w:i/>
+          <w:color w:val="646464"/>
+          <w:sz w:val="20"/>
+        </w:rPr>
+        <w:t>租赁产品及订单管理</w:t>
+      </w:r>
+    </w:p>
+    <w:p/>
+    <w:tbl>
+      <w:tblPr>
+        <w:tblStyle w:val="LightGrid-Accent1"/>
+        <w:tblW w:type="auto" w:w="0"/>
+        <w:jc w:val="center"/>
+        <w:tblLook w:firstColumn="1" w:firstRow="1" w:lastColumn="0" w:lastRow="0" w:noHBand="0" w:noVBand="1" w:val="04A0"/>
+      </w:tblPr>
+      <w:tblGrid>
+        <w:gridCol w:w="2268"/>
+        <w:gridCol w:w="7370"/>
+      </w:tblGrid>
+      <w:tr>
+        <w:tc>
+          <w:tcPr>
+            <w:tcW w:type="dxa" w:w="4986"/>
+            <w:shd w:fill="4472C4"/>
+          </w:tcPr>
+          <w:p>
+            <w:pPr>
+              <w:jc w:val="center"/>
+            </w:pPr>
+            <w:r>
+              <w:rPr>
+                <w:rFonts w:ascii="Microsoft YaHei" w:hAnsi="Microsoft YaHei"/>
+                <w:b/>
+                <w:color w:val="FFFFFF"/>
+                <w:sz w:val="24"/>
+              </w:rPr>
+              <w:t>功能</w:t>
+            </w:r>
+          </w:p>
+        </w:tc>
+        <w:tc>
+          <w:tcPr>
+            <w:tcW w:type="dxa" w:w="4986"/>
+            <w:shd w:fill="4472C4"/>
+          </w:tcPr>
+          <w:p>
+            <w:pPr>
+              <w:jc w:val="center"/>
+            </w:pPr>
+            <w:r>
+              <w:rPr>
+                <w:rFonts w:ascii="Microsoft YaHei" w:hAnsi="Microsoft YaHei"/>
+                <w:b/>
+                <w:color w:val="FFFFFF"/>
+                <w:sz w:val="24"/>
+              </w:rPr>
+              <w:t>功能截图</w:t>
+            </w:r>
+          </w:p>
+        </w:tc>
+      </w:tr>
+      <w:tr>
+        <w:tc>
+          <w:tcPr>
+            <w:tcW w:type="dxa" w:w="4986"/>
+          </w:tcPr>
+          <w:p>
+            <w:pPr>
+              <w:jc w:val="center"/>
+            </w:pPr>
+            <w:r>
+              <w:rPr>
+                <w:rFonts w:ascii="Microsoft YaHei" w:hAnsi="Microsoft YaHei"/>
+                <w:b/>
+                <w:sz w:val="22"/>
+              </w:rPr>
+              <w:t>产品-产品管理</w:t>
+            </w:r>
+          </w:p>
+        </w:tc>
+        <w:tc>
+          <w:tcPr>
+            <w:tcW w:type="dxa" w:w="4986"/>
+          </w:tcPr>
+          <w:p>
+            <w:pPr>
+              <w:jc w:val="center"/>
+            </w:pPr>
+            <w:r/>
+            <w:r>
+              <w:drawing>
+                <wp:inline xmlns:a="http://schemas.openxmlformats.org/drawingml/2006/main" xmlns:pic="http://schemas.openxmlformats.org/drawingml/2006/picture">
+                  <wp:extent cx="4320000" cy="2430000"/>
+                  <wp:docPr id="17" name="Picture 17"/>
+                  <wp:cNvGraphicFramePr>
+                    <a:graphicFrameLocks noChangeAspect="1"/>
+                  </wp:cNvGraphicFramePr>
+                  <a:graphic>
+                    <a:graphicData uri="http://schemas.openxmlformats.org/drawingml/2006/picture">
+                      <pic:pic>
+                        <pic:nvPicPr>
+                          <pic:cNvPr id="0" name="045_租赁-产品-产品管理.png"/>
+                          <pic:cNvPicPr/>
+                        </pic:nvPicPr>
+                        <pic:blipFill>
+                          <a:blip r:embed="rId23"/>
                           <a:stretch>
                             <a:fillRect/>
                           </a:stretch>
@@ -1156,7 +1626,7 @@
                 <w:b/>
                 <w:sz w:val="22"/>
               </w:rPr>
-              <w:t>产品分类</w:t>
+              <w:t>产品-产品分类</w:t>
             </w:r>
           </w:p>
         </w:tc>
@@ -1173,7 +1643,7 @@
               <w:drawing>
                 <wp:inline xmlns:a="http://schemas.openxmlformats.org/drawingml/2006/main" xmlns:pic="http://schemas.openxmlformats.org/drawingml/2006/picture">
                   <wp:extent cx="4320000" cy="2430000"/>
-                  <wp:docPr id="12" name="Picture 12"/>
+                  <wp:docPr id="18" name="Picture 18"/>
                   <wp:cNvGraphicFramePr>
                     <a:graphicFrameLocks noChangeAspect="1"/>
                   </wp:cNvGraphicFramePr>
@@ -1181,11 +1651,11 @@
                     <a:graphicData uri="http://schemas.openxmlformats.org/drawingml/2006/picture">
                       <pic:pic>
                         <pic:nvPicPr>
-                          <pic:cNvPr id="0" name="020_控制面板-产品分类.png"/>
+                          <pic:cNvPr id="0" name="046_租赁-产品-产品分类.png"/>
                           <pic:cNvPicPr/>
                         </pic:nvPicPr>
                         <pic:blipFill>
-                          <a:blip r:embed="rId20"/>
+                          <a:blip r:embed="rId24"/>
                           <a:stretch>
                             <a:fillRect/>
                           </a:stretch>
@@ -1221,7 +1691,7 @@
                 <w:b/>
                 <w:sz w:val="22"/>
               </w:rPr>
-              <w:t>节假日设置</w:t>
+              <w:t>租赁核销报表</w:t>
             </w:r>
           </w:p>
         </w:tc>
@@ -1238,7 +1708,7 @@
               <w:drawing>
                 <wp:inline xmlns:a="http://schemas.openxmlformats.org/drawingml/2006/main" xmlns:pic="http://schemas.openxmlformats.org/drawingml/2006/picture">
                   <wp:extent cx="4320000" cy="2430000"/>
-                  <wp:docPr id="13" name="Picture 13"/>
+                  <wp:docPr id="19" name="Picture 19"/>
                   <wp:cNvGraphicFramePr>
                     <a:graphicFrameLocks noChangeAspect="1"/>
                   </wp:cNvGraphicFramePr>
@@ -1246,11 +1716,11 @@
                     <a:graphicData uri="http://schemas.openxmlformats.org/drawingml/2006/picture">
                       <pic:pic>
                         <pic:nvPicPr>
-                          <pic:cNvPr id="0" name="021_控制面板-节假日设置.png"/>
+                          <pic:cNvPr id="0" name="050_报表-租赁核销报表.png"/>
                           <pic:cNvPicPr/>
                         </pic:nvPicPr>
                         <pic:blipFill>
-                          <a:blip r:embed="rId21"/>
+                          <a:blip r:embed="rId25"/>
                           <a:stretch>
                             <a:fillRect/>
                           </a:stretch>
@@ -1283,7 +1753,7 @@
           <w:color w:val="0066CC"/>
           <w:sz w:val="32"/>
         </w:rPr>
-        <w:t>六、报表管理</w:t>
+        <w:t>七、小程序管理</w:t>
       </w:r>
     </w:p>
     <w:p>
@@ -1294,21 +1764,129 @@
           <w:color w:val="646464"/>
           <w:sz w:val="20"/>
         </w:rPr>
-        <w:t>提供各类运营报表，包括票务核销报表、教学核销报表、教学数据看板等</w:t>
+        <w:t>小程序相关功能配置</w:t>
       </w:r>
     </w:p>
     <w:p/>
-    <w:p>
-      <w:r>
-        <w:rPr>
-          <w:rFonts w:ascii="Microsoft YaHei" w:hAnsi="Microsoft YaHei"/>
-          <w:i/>
-          <w:color w:val="969696"/>
-          <w:sz w:val="20"/>
-        </w:rPr>
-        <w:t>（该模块功能截图需要特定权限才能访问）</w:t>
-      </w:r>
-    </w:p>
+    <w:tbl>
+      <w:tblPr>
+        <w:tblStyle w:val="LightGrid-Accent1"/>
+        <w:tblW w:type="auto" w:w="0"/>
+        <w:jc w:val="center"/>
+        <w:tblLook w:firstColumn="1" w:firstRow="1" w:lastColumn="0" w:lastRow="0" w:noHBand="0" w:noVBand="1" w:val="04A0"/>
+      </w:tblPr>
+      <w:tblGrid>
+        <w:gridCol w:w="2268"/>
+        <w:gridCol w:w="7370"/>
+      </w:tblGrid>
+      <w:tr>
+        <w:tc>
+          <w:tcPr>
+            <w:tcW w:type="dxa" w:w="4986"/>
+            <w:shd w:fill="4472C4"/>
+          </w:tcPr>
+          <w:p>
+            <w:pPr>
+              <w:jc w:val="center"/>
+            </w:pPr>
+            <w:r>
+              <w:rPr>
+                <w:rFonts w:ascii="Microsoft YaHei" w:hAnsi="Microsoft YaHei"/>
+                <w:b/>
+                <w:color w:val="FFFFFF"/>
+                <w:sz w:val="24"/>
+              </w:rPr>
+              <w:t>功能</w:t>
+            </w:r>
+          </w:p>
+        </w:tc>
+        <w:tc>
+          <w:tcPr>
+            <w:tcW w:type="dxa" w:w="4986"/>
+            <w:shd w:fill="4472C4"/>
+          </w:tcPr>
+          <w:p>
+            <w:pPr>
+              <w:jc w:val="center"/>
+            </w:pPr>
+            <w:r>
+              <w:rPr>
+                <w:rFonts w:ascii="Microsoft YaHei" w:hAnsi="Microsoft YaHei"/>
+                <w:b/>
+                <w:color w:val="FFFFFF"/>
+                <w:sz w:val="24"/>
+              </w:rPr>
+              <w:t>功能截图</w:t>
+            </w:r>
+          </w:p>
+        </w:tc>
+      </w:tr>
+      <w:tr>
+        <w:tc>
+          <w:tcPr>
+            <w:tcW w:type="dxa" w:w="4986"/>
+          </w:tcPr>
+          <w:p>
+            <w:pPr>
+              <w:jc w:val="center"/>
+            </w:pPr>
+            <w:r>
+              <w:rPr>
+                <w:rFonts w:ascii="Microsoft YaHei" w:hAnsi="Microsoft YaHei"/>
+                <w:b/>
+                <w:sz w:val="22"/>
+              </w:rPr>
+              <w:t>首页装修</w:t>
+            </w:r>
+          </w:p>
+        </w:tc>
+        <w:tc>
+          <w:tcPr>
+            <w:tcW w:type="dxa" w:w="4986"/>
+          </w:tcPr>
+          <w:p>
+            <w:pPr>
+              <w:jc w:val="center"/>
+            </w:pPr>
+            <w:r/>
+            <w:r>
+              <w:drawing>
+                <wp:inline xmlns:a="http://schemas.openxmlformats.org/drawingml/2006/main" xmlns:pic="http://schemas.openxmlformats.org/drawingml/2006/picture">
+                  <wp:extent cx="4320000" cy="2430000"/>
+                  <wp:docPr id="20" name="Picture 20"/>
+                  <wp:cNvGraphicFramePr>
+                    <a:graphicFrameLocks noChangeAspect="1"/>
+                  </wp:cNvGraphicFramePr>
+                  <a:graphic>
+                    <a:graphicData uri="http://schemas.openxmlformats.org/drawingml/2006/picture">
+                      <pic:pic>
+                        <pic:nvPicPr>
+                          <pic:cNvPr id="0" name="047_小程序-首页装修.png"/>
+                          <pic:cNvPicPr/>
+                        </pic:nvPicPr>
+                        <pic:blipFill>
+                          <a:blip r:embed="rId26"/>
+                          <a:stretch>
+                            <a:fillRect/>
+                          </a:stretch>
+                        </pic:blipFill>
+                        <pic:spPr>
+                          <a:xfrm>
+                            <a:off x="0" y="0"/>
+                            <a:ext cx="4320000" cy="2430000"/>
+                          </a:xfrm>
+                          <a:prstGeom prst="rect"/>
+                        </pic:spPr>
+                      </pic:pic>
+                    </a:graphicData>
+                  </a:graphic>
+                </wp:inline>
+              </w:drawing>
+            </w:r>
+          </w:p>
+        </w:tc>
+      </w:tr>
+    </w:tbl>
     <w:p/>
     <w:p>
       <w:pPr>
@@ -1320,7 +1898,7 @@
           <w:color w:val="0066CC"/>
           <w:sz w:val="32"/>
         </w:rPr>
-        <w:t>七、系统管理</w:t>
+        <w:t>八、报表管理</w:t>
       </w:r>
     </w:p>
     <w:p>
@@ -1331,7 +1909,152 @@
           <w:color w:val="646464"/>
           <w:sz w:val="20"/>
         </w:rPr>
-        <w:t>系统基础功能的设置，包括文件，身份标识，日志及相关系统参数的设置</w:t>
+        <w:t>各类运营报表，包括票务、教学、租赁核销报表等</w:t>
+      </w:r>
+    </w:p>
+    <w:p/>
+    <w:tbl>
+      <w:tblPr>
+        <w:tblStyle w:val="LightGrid-Accent1"/>
+        <w:tblW w:type="auto" w:w="0"/>
+        <w:jc w:val="center"/>
+        <w:tblLook w:firstColumn="1" w:firstRow="1" w:lastColumn="0" w:lastRow="0" w:noHBand="0" w:noVBand="1" w:val="04A0"/>
+      </w:tblPr>
+      <w:tblGrid>
+        <w:gridCol w:w="2268"/>
+        <w:gridCol w:w="7370"/>
+      </w:tblGrid>
+      <w:tr>
+        <w:tc>
+          <w:tcPr>
+            <w:tcW w:type="dxa" w:w="4986"/>
+            <w:shd w:fill="4472C4"/>
+          </w:tcPr>
+          <w:p>
+            <w:pPr>
+              <w:jc w:val="center"/>
+            </w:pPr>
+            <w:r>
+              <w:rPr>
+                <w:rFonts w:ascii="Microsoft YaHei" w:hAnsi="Microsoft YaHei"/>
+                <w:b/>
+                <w:color w:val="FFFFFF"/>
+                <w:sz w:val="24"/>
+              </w:rPr>
+              <w:t>功能</w:t>
+            </w:r>
+          </w:p>
+        </w:tc>
+        <w:tc>
+          <w:tcPr>
+            <w:tcW w:type="dxa" w:w="4986"/>
+            <w:shd w:fill="4472C4"/>
+          </w:tcPr>
+          <w:p>
+            <w:pPr>
+              <w:jc w:val="center"/>
+            </w:pPr>
+            <w:r>
+              <w:rPr>
+                <w:rFonts w:ascii="Microsoft YaHei" w:hAnsi="Microsoft YaHei"/>
+                <w:b/>
+                <w:color w:val="FFFFFF"/>
+                <w:sz w:val="24"/>
+              </w:rPr>
+              <w:t>功能截图</w:t>
+            </w:r>
+          </w:p>
+        </w:tc>
+      </w:tr>
+      <w:tr>
+        <w:tc>
+          <w:tcPr>
+            <w:tcW w:type="dxa" w:w="4986"/>
+          </w:tcPr>
+          <w:p>
+            <w:pPr>
+              <w:jc w:val="center"/>
+            </w:pPr>
+            <w:r>
+              <w:rPr>
+                <w:rFonts w:ascii="Microsoft YaHei" w:hAnsi="Microsoft YaHei"/>
+                <w:b/>
+                <w:sz w:val="22"/>
+              </w:rPr>
+              <w:t>教学核销报表</w:t>
+            </w:r>
+          </w:p>
+        </w:tc>
+        <w:tc>
+          <w:tcPr>
+            <w:tcW w:type="dxa" w:w="4986"/>
+          </w:tcPr>
+          <w:p>
+            <w:pPr>
+              <w:jc w:val="center"/>
+            </w:pPr>
+            <w:r/>
+            <w:r>
+              <w:drawing>
+                <wp:inline xmlns:a="http://schemas.openxmlformats.org/drawingml/2006/main" xmlns:pic="http://schemas.openxmlformats.org/drawingml/2006/picture">
+                  <wp:extent cx="4320000" cy="2430000"/>
+                  <wp:docPr id="21" name="Picture 21"/>
+                  <wp:cNvGraphicFramePr>
+                    <a:graphicFrameLocks noChangeAspect="1"/>
+                  </wp:cNvGraphicFramePr>
+                  <a:graphic>
+                    <a:graphicData uri="http://schemas.openxmlformats.org/drawingml/2006/picture">
+                      <pic:pic>
+                        <pic:nvPicPr>
+                          <pic:cNvPr id="0" name="049_报表-教学核销报表.png"/>
+                          <pic:cNvPicPr/>
+                        </pic:nvPicPr>
+                        <pic:blipFill>
+                          <a:blip r:embed="rId27"/>
+                          <a:stretch>
+                            <a:fillRect/>
+                          </a:stretch>
+                        </pic:blipFill>
+                        <pic:spPr>
+                          <a:xfrm>
+                            <a:off x="0" y="0"/>
+                            <a:ext cx="4320000" cy="2430000"/>
+                          </a:xfrm>
+                          <a:prstGeom prst="rect"/>
+                        </pic:spPr>
+                      </pic:pic>
+                    </a:graphicData>
+                  </a:graphic>
+                </wp:inline>
+              </w:drawing>
+            </w:r>
+          </w:p>
+        </w:tc>
+      </w:tr>
+    </w:tbl>
+    <w:p/>
+    <w:p>
+      <w:pPr>
+        <w:pStyle w:val="Heading1"/>
+      </w:pPr>
+      <w:r>
+        <w:rPr>
+          <w:rFonts w:ascii="Microsoft YaHei" w:hAnsi="Microsoft YaHei"/>
+          <w:color w:val="0066CC"/>
+          <w:sz w:val="32"/>
+        </w:rPr>
+        <w:t>九、系统管理</w:t>
+      </w:r>
+    </w:p>
+    <w:p>
+      <w:r>
+        <w:rPr>
+          <w:rFonts w:ascii="Microsoft YaHei" w:hAnsi="Microsoft YaHei"/>
+          <w:i/>
+          <w:color w:val="646464"/>
+          <w:sz w:val="20"/>
+        </w:rPr>
+        <w:t>系统基础功能设置</w:t>
       </w:r>
     </w:p>
     <w:p/>
@@ -1420,7 +2143,7 @@
               <w:drawing>
                 <wp:inline xmlns:a="http://schemas.openxmlformats.org/drawingml/2006/main" xmlns:pic="http://schemas.openxmlformats.org/drawingml/2006/picture">
                   <wp:extent cx="4320000" cy="2430000"/>
-                  <wp:docPr id="14" name="Picture 14"/>
+                  <wp:docPr id="22" name="Picture 22"/>
                   <wp:cNvGraphicFramePr>
                     <a:graphicFrameLocks noChangeAspect="1"/>
                   </wp:cNvGraphicFramePr>
@@ -1432,7 +2155,7 @@
                           <pic:cNvPicPr/>
                         </pic:nvPicPr>
                         <pic:blipFill>
-                          <a:blip r:embed="rId22"/>
+                          <a:blip r:embed="rId28"/>
                           <a:stretch>
                             <a:fillRect/>
                           </a:stretch>
@@ -1485,7 +2208,7 @@
               <w:drawing>
                 <wp:inline xmlns:a="http://schemas.openxmlformats.org/drawingml/2006/main" xmlns:pic="http://schemas.openxmlformats.org/drawingml/2006/picture">
                   <wp:extent cx="4320000" cy="2430000"/>
-                  <wp:docPr id="15" name="Picture 15"/>
+                  <wp:docPr id="23" name="Picture 23"/>
                   <wp:cNvGraphicFramePr>
                     <a:graphicFrameLocks noChangeAspect="1"/>
                   </wp:cNvGraphicFramePr>
@@ -1497,7 +2220,7 @@
                           <pic:cNvPicPr/>
                         </pic:nvPicPr>
                         <pic:blipFill>
-                          <a:blip r:embed="rId23"/>
+                          <a:blip r:embed="rId29"/>
                           <a:stretch>
                             <a:fillRect/>
                           </a:stretch>
@@ -1550,7 +2273,7 @@
               <w:drawing>
                 <wp:inline xmlns:a="http://schemas.openxmlformats.org/drawingml/2006/main" xmlns:pic="http://schemas.openxmlformats.org/drawingml/2006/picture">
                   <wp:extent cx="4320000" cy="2430000"/>
-                  <wp:docPr id="16" name="Picture 16"/>
+                  <wp:docPr id="24" name="Picture 24"/>
                   <wp:cNvGraphicFramePr>
                     <a:graphicFrameLocks noChangeAspect="1"/>
                   </wp:cNvGraphicFramePr>
@@ -1562,7 +2285,7 @@
                           <pic:cNvPicPr/>
                         </pic:nvPicPr>
                         <pic:blipFill>
-                          <a:blip r:embed="rId24"/>
+                          <a:blip r:embed="rId30"/>
                           <a:stretch>
                             <a:fillRect/>
                           </a:stretch>
@@ -1615,7 +2338,7 @@
               <w:drawing>
                 <wp:inline xmlns:a="http://schemas.openxmlformats.org/drawingml/2006/main" xmlns:pic="http://schemas.openxmlformats.org/drawingml/2006/picture">
                   <wp:extent cx="4320000" cy="2430000"/>
-                  <wp:docPr id="17" name="Picture 17"/>
+                  <wp:docPr id="25" name="Picture 25"/>
                   <wp:cNvGraphicFramePr>
                     <a:graphicFrameLocks noChangeAspect="1"/>
                   </wp:cNvGraphicFramePr>
@@ -1627,7 +2350,7 @@
                           <pic:cNvPicPr/>
                         </pic:nvPicPr>
                         <pic:blipFill>
-                          <a:blip r:embed="rId25"/>
+                          <a:blip r:embed="rId31"/>
                           <a:stretch>
                             <a:fillRect/>
                           </a:stretch>
@@ -1680,7 +2403,7 @@
               <w:drawing>
                 <wp:inline xmlns:a="http://schemas.openxmlformats.org/drawingml/2006/main" xmlns:pic="http://schemas.openxmlformats.org/drawingml/2006/picture">
                   <wp:extent cx="4320000" cy="2430000"/>
-                  <wp:docPr id="18" name="Picture 18"/>
+                  <wp:docPr id="26" name="Picture 26"/>
                   <wp:cNvGraphicFramePr>
                     <a:graphicFrameLocks noChangeAspect="1"/>
                   </wp:cNvGraphicFramePr>
@@ -1692,7 +2415,7 @@
                           <pic:cNvPicPr/>
                         </pic:nvPicPr>
                         <pic:blipFill>
-                          <a:blip r:embed="rId26"/>
+                          <a:blip r:embed="rId32"/>
                           <a:stretch>
                             <a:fillRect/>
                           </a:stretch>
@@ -1745,7 +2468,7 @@
               <w:drawing>
                 <wp:inline xmlns:a="http://schemas.openxmlformats.org/drawingml/2006/main" xmlns:pic="http://schemas.openxmlformats.org/drawingml/2006/picture">
                   <wp:extent cx="4320000" cy="2430000"/>
-                  <wp:docPr id="19" name="Picture 19"/>
+                  <wp:docPr id="27" name="Picture 27"/>
                   <wp:cNvGraphicFramePr>
                     <a:graphicFrameLocks noChangeAspect="1"/>
                   </wp:cNvGraphicFramePr>
@@ -1757,7 +2480,7 @@
                           <pic:cNvPicPr/>
                         </pic:nvPicPr>
                         <pic:blipFill>
-                          <a:blip r:embed="rId27"/>
+                          <a:blip r:embed="rId33"/>
                           <a:stretch>
                             <a:fillRect/>
                           </a:stretch>

</xml_diff>

<commit_message>
feat: Add lease order finding script and update menu data
Co-authored-by: chentianran <chentianran@shengdaxun.com>
</commit_message>
<xml_diff>
--- a/票务系统功能截图对照文档.docx
+++ b/票务系统功能截图对照文档.docx
@@ -121,7 +121,7 @@
                 <w:b/>
                 <w:sz w:val="22"/>
               </w:rPr>
-              <w:t>票务管理</w:t>
+              <w:t>首页</w:t>
             </w:r>
           </w:p>
         </w:tc>
@@ -146,11 +146,76 @@
                     <a:graphicData uri="http://schemas.openxmlformats.org/drawingml/2006/picture">
                       <pic:pic>
                         <pic:nvPicPr>
+                          <pic:cNvPr id="0" name="001_首页_默认页面.png"/>
+                          <pic:cNvPicPr/>
+                        </pic:nvPicPr>
+                        <pic:blipFill>
+                          <a:blip r:embed="rId9"/>
+                          <a:stretch>
+                            <a:fillRect/>
+                          </a:stretch>
+                        </pic:blipFill>
+                        <pic:spPr>
+                          <a:xfrm>
+                            <a:off x="0" y="0"/>
+                            <a:ext cx="4320000" cy="2430000"/>
+                          </a:xfrm>
+                          <a:prstGeom prst="rect"/>
+                        </pic:spPr>
+                      </pic:pic>
+                    </a:graphicData>
+                  </a:graphic>
+                </wp:inline>
+              </w:drawing>
+            </w:r>
+          </w:p>
+        </w:tc>
+      </w:tr>
+      <w:tr>
+        <w:tc>
+          <w:tcPr>
+            <w:tcW w:type="dxa" w:w="4986"/>
+          </w:tcPr>
+          <w:p>
+            <w:pPr>
+              <w:jc w:val="center"/>
+            </w:pPr>
+            <w:r>
+              <w:rPr>
+                <w:rFonts w:ascii="Microsoft YaHei" w:hAnsi="Microsoft YaHei"/>
+                <w:b/>
+                <w:sz w:val="22"/>
+              </w:rPr>
+              <w:t>票务管理</w:t>
+            </w:r>
+          </w:p>
+        </w:tc>
+        <w:tc>
+          <w:tcPr>
+            <w:tcW w:type="dxa" w:w="4986"/>
+          </w:tcPr>
+          <w:p>
+            <w:pPr>
+              <w:jc w:val="center"/>
+            </w:pPr>
+            <w:r/>
+            <w:r>
+              <w:drawing>
+                <wp:inline xmlns:a="http://schemas.openxmlformats.org/drawingml/2006/main" xmlns:pic="http://schemas.openxmlformats.org/drawingml/2006/picture">
+                  <wp:extent cx="4320000" cy="2430000"/>
+                  <wp:docPr id="2" name="Picture 2"/>
+                  <wp:cNvGraphicFramePr>
+                    <a:graphicFrameLocks noChangeAspect="1"/>
+                  </wp:cNvGraphicFramePr>
+                  <a:graphic>
+                    <a:graphicData uri="http://schemas.openxmlformats.org/drawingml/2006/picture">
+                      <pic:pic>
+                        <pic:nvPicPr>
                           <pic:cNvPr id="0" name="006_订单管理-票务管理.png"/>
                           <pic:cNvPicPr/>
                         </pic:nvPicPr>
                         <pic:blipFill>
-                          <a:blip r:embed="rId9"/>
+                          <a:blip r:embed="rId10"/>
                           <a:stretch>
                             <a:fillRect/>
                           </a:stretch>
@@ -203,7 +268,7 @@
               <w:drawing>
                 <wp:inline xmlns:a="http://schemas.openxmlformats.org/drawingml/2006/main" xmlns:pic="http://schemas.openxmlformats.org/drawingml/2006/picture">
                   <wp:extent cx="4320000" cy="2430000"/>
-                  <wp:docPr id="2" name="Picture 2"/>
+                  <wp:docPr id="3" name="Picture 3"/>
                   <wp:cNvGraphicFramePr>
                     <a:graphicFrameLocks noChangeAspect="1"/>
                   </wp:cNvGraphicFramePr>
@@ -215,7 +280,7 @@
                           <pic:cNvPicPr/>
                         </pic:nvPicPr>
                         <pic:blipFill>
-                          <a:blip r:embed="rId10"/>
+                          <a:blip r:embed="rId11"/>
                           <a:stretch>
                             <a:fillRect/>
                           </a:stretch>
@@ -268,7 +333,7 @@
               <w:drawing>
                 <wp:inline xmlns:a="http://schemas.openxmlformats.org/drawingml/2006/main" xmlns:pic="http://schemas.openxmlformats.org/drawingml/2006/picture">
                   <wp:extent cx="4320000" cy="2430000"/>
-                  <wp:docPr id="3" name="Picture 3"/>
+                  <wp:docPr id="4" name="Picture 4"/>
                   <wp:cNvGraphicFramePr>
                     <a:graphicFrameLocks noChangeAspect="1"/>
                   </wp:cNvGraphicFramePr>
@@ -280,7 +345,7 @@
                           <pic:cNvPicPr/>
                         </pic:nvPicPr>
                         <pic:blipFill>
-                          <a:blip r:embed="rId11"/>
+                          <a:blip r:embed="rId12"/>
                           <a:stretch>
                             <a:fillRect/>
                           </a:stretch>
@@ -333,7 +398,7 @@
               <w:drawing>
                 <wp:inline xmlns:a="http://schemas.openxmlformats.org/drawingml/2006/main" xmlns:pic="http://schemas.openxmlformats.org/drawingml/2006/picture">
                   <wp:extent cx="4320000" cy="2430000"/>
-                  <wp:docPr id="4" name="Picture 4"/>
+                  <wp:docPr id="5" name="Picture 5"/>
                   <wp:cNvGraphicFramePr>
                     <a:graphicFrameLocks noChangeAspect="1"/>
                   </wp:cNvGraphicFramePr>
@@ -345,137 +410,7 @@
                           <pic:cNvPicPr/>
                         </pic:nvPicPr>
                         <pic:blipFill>
-                          <a:blip r:embed="rId12"/>
-                          <a:stretch>
-                            <a:fillRect/>
-                          </a:stretch>
-                        </pic:blipFill>
-                        <pic:spPr>
-                          <a:xfrm>
-                            <a:off x="0" y="0"/>
-                            <a:ext cx="4320000" cy="2430000"/>
-                          </a:xfrm>
-                          <a:prstGeom prst="rect"/>
-                        </pic:spPr>
-                      </pic:pic>
-                    </a:graphicData>
-                  </a:graphic>
-                </wp:inline>
-              </w:drawing>
-            </w:r>
-          </w:p>
-        </w:tc>
-      </w:tr>
-      <w:tr>
-        <w:tc>
-          <w:tcPr>
-            <w:tcW w:type="dxa" w:w="4986"/>
-          </w:tcPr>
-          <w:p>
-            <w:pPr>
-              <w:jc w:val="center"/>
-            </w:pPr>
-            <w:r>
-              <w:rPr>
-                <w:rFonts w:ascii="Microsoft YaHei" w:hAnsi="Microsoft YaHei"/>
-                <w:b/>
-                <w:sz w:val="22"/>
-              </w:rPr>
-              <w:t>产品管理</w:t>
-            </w:r>
-          </w:p>
-        </w:tc>
-        <w:tc>
-          <w:tcPr>
-            <w:tcW w:type="dxa" w:w="4986"/>
-          </w:tcPr>
-          <w:p>
-            <w:pPr>
-              <w:jc w:val="center"/>
-            </w:pPr>
-            <w:r/>
-            <w:r>
-              <w:drawing>
-                <wp:inline xmlns:a="http://schemas.openxmlformats.org/drawingml/2006/main" xmlns:pic="http://schemas.openxmlformats.org/drawingml/2006/picture">
-                  <wp:extent cx="4320000" cy="2430000"/>
-                  <wp:docPr id="5" name="Picture 5"/>
-                  <wp:cNvGraphicFramePr>
-                    <a:graphicFrameLocks noChangeAspect="1"/>
-                  </wp:cNvGraphicFramePr>
-                  <a:graphic>
-                    <a:graphicData uri="http://schemas.openxmlformats.org/drawingml/2006/picture">
-                      <pic:pic>
-                        <pic:nvPicPr>
-                          <pic:cNvPr id="0" name="019_控制面板-产品管理.png"/>
-                          <pic:cNvPicPr/>
-                        </pic:nvPicPr>
-                        <pic:blipFill>
                           <a:blip r:embed="rId13"/>
-                          <a:stretch>
-                            <a:fillRect/>
-                          </a:stretch>
-                        </pic:blipFill>
-                        <pic:spPr>
-                          <a:xfrm>
-                            <a:off x="0" y="0"/>
-                            <a:ext cx="4320000" cy="2430000"/>
-                          </a:xfrm>
-                          <a:prstGeom prst="rect"/>
-                        </pic:spPr>
-                      </pic:pic>
-                    </a:graphicData>
-                  </a:graphic>
-                </wp:inline>
-              </w:drawing>
-            </w:r>
-          </w:p>
-        </w:tc>
-      </w:tr>
-      <w:tr>
-        <w:tc>
-          <w:tcPr>
-            <w:tcW w:type="dxa" w:w="4986"/>
-          </w:tcPr>
-          <w:p>
-            <w:pPr>
-              <w:jc w:val="center"/>
-            </w:pPr>
-            <w:r>
-              <w:rPr>
-                <w:rFonts w:ascii="Microsoft YaHei" w:hAnsi="Microsoft YaHei"/>
-                <w:b/>
-                <w:sz w:val="22"/>
-              </w:rPr>
-              <w:t>产品分类</w:t>
-            </w:r>
-          </w:p>
-        </w:tc>
-        <w:tc>
-          <w:tcPr>
-            <w:tcW w:type="dxa" w:w="4986"/>
-          </w:tcPr>
-          <w:p>
-            <w:pPr>
-              <w:jc w:val="center"/>
-            </w:pPr>
-            <w:r/>
-            <w:r>
-              <w:drawing>
-                <wp:inline xmlns:a="http://schemas.openxmlformats.org/drawingml/2006/main" xmlns:pic="http://schemas.openxmlformats.org/drawingml/2006/picture">
-                  <wp:extent cx="4320000" cy="2430000"/>
-                  <wp:docPr id="6" name="Picture 6"/>
-                  <wp:cNvGraphicFramePr>
-                    <a:graphicFrameLocks noChangeAspect="1"/>
-                  </wp:cNvGraphicFramePr>
-                  <a:graphic>
-                    <a:graphicData uri="http://schemas.openxmlformats.org/drawingml/2006/picture">
-                      <pic:pic>
-                        <pic:nvPicPr>
-                          <pic:cNvPr id="0" name="020_控制面板-产品分类.png"/>
-                          <pic:cNvPicPr/>
-                        </pic:nvPicPr>
-                        <pic:blipFill>
-                          <a:blip r:embed="rId14"/>
                           <a:stretch>
                             <a:fillRect/>
                           </a:stretch>
@@ -528,7 +463,7 @@
               <w:drawing>
                 <wp:inline xmlns:a="http://schemas.openxmlformats.org/drawingml/2006/main" xmlns:pic="http://schemas.openxmlformats.org/drawingml/2006/picture">
                   <wp:extent cx="4320000" cy="2430000"/>
-                  <wp:docPr id="7" name="Picture 7"/>
+                  <wp:docPr id="6" name="Picture 6"/>
                   <wp:cNvGraphicFramePr>
                     <a:graphicFrameLocks noChangeAspect="1"/>
                   </wp:cNvGraphicFramePr>
@@ -536,11 +471,11 @@
                     <a:graphicData uri="http://schemas.openxmlformats.org/drawingml/2006/picture">
                       <pic:pic>
                         <pic:nvPicPr>
-                          <pic:cNvPr id="0" name="019_控制面板-产品管理.png"/>
+                          <pic:cNvPr id="0" name="043_票务-产品-产品管理.png"/>
                           <pic:cNvPicPr/>
                         </pic:nvPicPr>
                         <pic:blipFill>
-                          <a:blip r:embed="rId13"/>
+                          <a:blip r:embed="rId14"/>
                           <a:stretch>
                             <a:fillRect/>
                           </a:stretch>
@@ -593,7 +528,7 @@
               <w:drawing>
                 <wp:inline xmlns:a="http://schemas.openxmlformats.org/drawingml/2006/main" xmlns:pic="http://schemas.openxmlformats.org/drawingml/2006/picture">
                   <wp:extent cx="4320000" cy="2430000"/>
-                  <wp:docPr id="8" name="Picture 8"/>
+                  <wp:docPr id="7" name="Picture 7"/>
                   <wp:cNvGraphicFramePr>
                     <a:graphicFrameLocks noChangeAspect="1"/>
                   </wp:cNvGraphicFramePr>
@@ -601,72 +536,7 @@
                     <a:graphicData uri="http://schemas.openxmlformats.org/drawingml/2006/picture">
                       <pic:pic>
                         <pic:nvPicPr>
-                          <pic:cNvPr id="0" name="020_控制面板-产品分类.png"/>
-                          <pic:cNvPicPr/>
-                        </pic:nvPicPr>
-                        <pic:blipFill>
-                          <a:blip r:embed="rId14"/>
-                          <a:stretch>
-                            <a:fillRect/>
-                          </a:stretch>
-                        </pic:blipFill>
-                        <pic:spPr>
-                          <a:xfrm>
-                            <a:off x="0" y="0"/>
-                            <a:ext cx="4320000" cy="2430000"/>
-                          </a:xfrm>
-                          <a:prstGeom prst="rect"/>
-                        </pic:spPr>
-                      </pic:pic>
-                    </a:graphicData>
-                  </a:graphic>
-                </wp:inline>
-              </w:drawing>
-            </w:r>
-          </w:p>
-        </w:tc>
-      </w:tr>
-      <w:tr>
-        <w:tc>
-          <w:tcPr>
-            <w:tcW w:type="dxa" w:w="4986"/>
-          </w:tcPr>
-          <w:p>
-            <w:pPr>
-              <w:jc w:val="center"/>
-            </w:pPr>
-            <w:r>
-              <w:rPr>
-                <w:rFonts w:ascii="Microsoft YaHei" w:hAnsi="Microsoft YaHei"/>
-                <w:b/>
-                <w:sz w:val="22"/>
-              </w:rPr>
-              <w:t>票务核销报表</w:t>
-            </w:r>
-          </w:p>
-        </w:tc>
-        <w:tc>
-          <w:tcPr>
-            <w:tcW w:type="dxa" w:w="4986"/>
-          </w:tcPr>
-          <w:p>
-            <w:pPr>
-              <w:jc w:val="center"/>
-            </w:pPr>
-            <w:r/>
-            <w:r>
-              <w:drawing>
-                <wp:inline xmlns:a="http://schemas.openxmlformats.org/drawingml/2006/main" xmlns:pic="http://schemas.openxmlformats.org/drawingml/2006/picture">
-                  <wp:extent cx="4320000" cy="2430000"/>
-                  <wp:docPr id="9" name="Picture 9"/>
-                  <wp:cNvGraphicFramePr>
-                    <a:graphicFrameLocks noChangeAspect="1"/>
-                  </wp:cNvGraphicFramePr>
-                  <a:graphic>
-                    <a:graphicData uri="http://schemas.openxmlformats.org/drawingml/2006/picture">
-                      <pic:pic>
-                        <pic:nvPicPr>
-                          <pic:cNvPr id="0" name="048_报表-票务核销报表.png"/>
+                          <pic:cNvPr id="0" name="044_票务-产品-产品分类.png"/>
                           <pic:cNvPicPr/>
                         </pic:nvPicPr>
                         <pic:blipFill>
@@ -803,7 +673,7 @@
               <w:drawing>
                 <wp:inline xmlns:a="http://schemas.openxmlformats.org/drawingml/2006/main" xmlns:pic="http://schemas.openxmlformats.org/drawingml/2006/picture">
                   <wp:extent cx="4320000" cy="2430000"/>
-                  <wp:docPr id="10" name="Picture 10"/>
+                  <wp:docPr id="8" name="Picture 8"/>
                   <wp:cNvGraphicFramePr>
                     <a:graphicFrameLocks noChangeAspect="1"/>
                   </wp:cNvGraphicFramePr>
@@ -948,7 +818,7 @@
               <w:drawing>
                 <wp:inline xmlns:a="http://schemas.openxmlformats.org/drawingml/2006/main" xmlns:pic="http://schemas.openxmlformats.org/drawingml/2006/picture">
                   <wp:extent cx="4320000" cy="2430000"/>
-                  <wp:docPr id="11" name="Picture 11"/>
+                  <wp:docPr id="9" name="Picture 9"/>
                   <wp:cNvGraphicFramePr>
                     <a:graphicFrameLocks noChangeAspect="1"/>
                   </wp:cNvGraphicFramePr>
@@ -1013,7 +883,7 @@
               <w:drawing>
                 <wp:inline xmlns:a="http://schemas.openxmlformats.org/drawingml/2006/main" xmlns:pic="http://schemas.openxmlformats.org/drawingml/2006/picture">
                   <wp:extent cx="4320000" cy="2430000"/>
-                  <wp:docPr id="12" name="Picture 12"/>
+                  <wp:docPr id="10" name="Picture 10"/>
                   <wp:cNvGraphicFramePr>
                     <a:graphicFrameLocks noChangeAspect="1"/>
                   </wp:cNvGraphicFramePr>
@@ -1078,7 +948,7 @@
               <w:drawing>
                 <wp:inline xmlns:a="http://schemas.openxmlformats.org/drawingml/2006/main" xmlns:pic="http://schemas.openxmlformats.org/drawingml/2006/picture">
                   <wp:extent cx="4320000" cy="2430000"/>
-                  <wp:docPr id="13" name="Picture 13"/>
+                  <wp:docPr id="11" name="Picture 11"/>
                   <wp:cNvGraphicFramePr>
                     <a:graphicFrameLocks noChangeAspect="1"/>
                   </wp:cNvGraphicFramePr>
@@ -1223,7 +1093,7 @@
               <w:drawing>
                 <wp:inline xmlns:a="http://schemas.openxmlformats.org/drawingml/2006/main" xmlns:pic="http://schemas.openxmlformats.org/drawingml/2006/picture">
                   <wp:extent cx="4320000" cy="2430000"/>
-                  <wp:docPr id="14" name="Picture 14"/>
+                  <wp:docPr id="12" name="Picture 12"/>
                   <wp:cNvGraphicFramePr>
                     <a:graphicFrameLocks noChangeAspect="1"/>
                   </wp:cNvGraphicFramePr>
@@ -1288,7 +1158,7 @@
               <w:drawing>
                 <wp:inline xmlns:a="http://schemas.openxmlformats.org/drawingml/2006/main" xmlns:pic="http://schemas.openxmlformats.org/drawingml/2006/picture">
                   <wp:extent cx="4320000" cy="2430000"/>
-                  <wp:docPr id="15" name="Picture 15"/>
+                  <wp:docPr id="13" name="Picture 13"/>
                   <wp:cNvGraphicFramePr>
                     <a:graphicFrameLocks noChangeAspect="1"/>
                   </wp:cNvGraphicFramePr>
@@ -1397,6 +1267,136 @@
                 <w:sz w:val="24"/>
               </w:rPr>
               <w:t>功能截图</w:t>
+            </w:r>
+          </w:p>
+        </w:tc>
+      </w:tr>
+      <w:tr>
+        <w:tc>
+          <w:tcPr>
+            <w:tcW w:type="dxa" w:w="4986"/>
+          </w:tcPr>
+          <w:p>
+            <w:pPr>
+              <w:jc w:val="center"/>
+            </w:pPr>
+            <w:r>
+              <w:rPr>
+                <w:rFonts w:ascii="Microsoft YaHei" w:hAnsi="Microsoft YaHei"/>
+                <w:b/>
+                <w:sz w:val="22"/>
+              </w:rPr>
+              <w:t>产品管理</w:t>
+            </w:r>
+          </w:p>
+        </w:tc>
+        <w:tc>
+          <w:tcPr>
+            <w:tcW w:type="dxa" w:w="4986"/>
+          </w:tcPr>
+          <w:p>
+            <w:pPr>
+              <w:jc w:val="center"/>
+            </w:pPr>
+            <w:r/>
+            <w:r>
+              <w:drawing>
+                <wp:inline xmlns:a="http://schemas.openxmlformats.org/drawingml/2006/main" xmlns:pic="http://schemas.openxmlformats.org/drawingml/2006/picture">
+                  <wp:extent cx="4320000" cy="2430000"/>
+                  <wp:docPr id="14" name="Picture 14"/>
+                  <wp:cNvGraphicFramePr>
+                    <a:graphicFrameLocks noChangeAspect="1"/>
+                  </wp:cNvGraphicFramePr>
+                  <a:graphic>
+                    <a:graphicData uri="http://schemas.openxmlformats.org/drawingml/2006/picture">
+                      <pic:pic>
+                        <pic:nvPicPr>
+                          <pic:cNvPr id="0" name="043_票务-产品-产品管理.png"/>
+                          <pic:cNvPicPr/>
+                        </pic:nvPicPr>
+                        <pic:blipFill>
+                          <a:blip r:embed="rId14"/>
+                          <a:stretch>
+                            <a:fillRect/>
+                          </a:stretch>
+                        </pic:blipFill>
+                        <pic:spPr>
+                          <a:xfrm>
+                            <a:off x="0" y="0"/>
+                            <a:ext cx="4320000" cy="2430000"/>
+                          </a:xfrm>
+                          <a:prstGeom prst="rect"/>
+                        </pic:spPr>
+                      </pic:pic>
+                    </a:graphicData>
+                  </a:graphic>
+                </wp:inline>
+              </w:drawing>
+            </w:r>
+          </w:p>
+        </w:tc>
+      </w:tr>
+      <w:tr>
+        <w:tc>
+          <w:tcPr>
+            <w:tcW w:type="dxa" w:w="4986"/>
+          </w:tcPr>
+          <w:p>
+            <w:pPr>
+              <w:jc w:val="center"/>
+            </w:pPr>
+            <w:r>
+              <w:rPr>
+                <w:rFonts w:ascii="Microsoft YaHei" w:hAnsi="Microsoft YaHei"/>
+                <w:b/>
+                <w:sz w:val="22"/>
+              </w:rPr>
+              <w:t>产品分类</w:t>
+            </w:r>
+          </w:p>
+        </w:tc>
+        <w:tc>
+          <w:tcPr>
+            <w:tcW w:type="dxa" w:w="4986"/>
+          </w:tcPr>
+          <w:p>
+            <w:pPr>
+              <w:jc w:val="center"/>
+            </w:pPr>
+            <w:r/>
+            <w:r>
+              <w:drawing>
+                <wp:inline xmlns:a="http://schemas.openxmlformats.org/drawingml/2006/main" xmlns:pic="http://schemas.openxmlformats.org/drawingml/2006/picture">
+                  <wp:extent cx="4320000" cy="2430000"/>
+                  <wp:docPr id="15" name="Picture 15"/>
+                  <wp:cNvGraphicFramePr>
+                    <a:graphicFrameLocks noChangeAspect="1"/>
+                  </wp:cNvGraphicFramePr>
+                  <a:graphic>
+                    <a:graphicData uri="http://schemas.openxmlformats.org/drawingml/2006/picture">
+                      <pic:pic>
+                        <pic:nvPicPr>
+                          <pic:cNvPr id="0" name="044_票务-产品-产品分类.png"/>
+                          <pic:cNvPicPr/>
+                        </pic:nvPicPr>
+                        <pic:blipFill>
+                          <a:blip r:embed="rId15"/>
+                          <a:stretch>
+                            <a:fillRect/>
+                          </a:stretch>
+                        </pic:blipFill>
+                        <pic:spPr>
+                          <a:xfrm>
+                            <a:off x="0" y="0"/>
+                            <a:ext cx="4320000" cy="2430000"/>
+                          </a:xfrm>
+                          <a:prstGeom prst="rect"/>
+                        </pic:spPr>
+                      </pic:pic>
+                    </a:graphicData>
+                  </a:graphic>
+                </wp:inline>
+              </w:drawing>
             </w:r>
           </w:p>
         </w:tc>
@@ -1741,6 +1741,71 @@
           </w:p>
         </w:tc>
       </w:tr>
+      <w:tr>
+        <w:tc>
+          <w:tcPr>
+            <w:tcW w:type="dxa" w:w="4986"/>
+          </w:tcPr>
+          <w:p>
+            <w:pPr>
+              <w:jc w:val="center"/>
+            </w:pPr>
+            <w:r>
+              <w:rPr>
+                <w:rFonts w:ascii="Microsoft YaHei" w:hAnsi="Microsoft YaHei"/>
+                <w:b/>
+                <w:sz w:val="22"/>
+              </w:rPr>
+              <w:t>订单</w:t>
+            </w:r>
+          </w:p>
+        </w:tc>
+        <w:tc>
+          <w:tcPr>
+            <w:tcW w:type="dxa" w:w="4986"/>
+          </w:tcPr>
+          <w:p>
+            <w:pPr>
+              <w:jc w:val="center"/>
+            </w:pPr>
+            <w:r/>
+            <w:r>
+              <w:drawing>
+                <wp:inline xmlns:a="http://schemas.openxmlformats.org/drawingml/2006/main" xmlns:pic="http://schemas.openxmlformats.org/drawingml/2006/picture">
+                  <wp:extent cx="4320000" cy="2430000"/>
+                  <wp:docPr id="20" name="Picture 20"/>
+                  <wp:cNvGraphicFramePr>
+                    <a:graphicFrameLocks noChangeAspect="1"/>
+                  </wp:cNvGraphicFramePr>
+                  <a:graphic>
+                    <a:graphicData uri="http://schemas.openxmlformats.org/drawingml/2006/picture">
+                      <pic:pic>
+                        <pic:nvPicPr>
+                          <pic:cNvPr id="0" name="051_租赁-订单.png"/>
+                          <pic:cNvPicPr/>
+                        </pic:nvPicPr>
+                        <pic:blipFill>
+                          <a:blip r:embed="rId26"/>
+                          <a:stretch>
+                            <a:fillRect/>
+                          </a:stretch>
+                        </pic:blipFill>
+                        <pic:spPr>
+                          <a:xfrm>
+                            <a:off x="0" y="0"/>
+                            <a:ext cx="4320000" cy="2430000"/>
+                          </a:xfrm>
+                          <a:prstGeom prst="rect"/>
+                        </pic:spPr>
+                      </pic:pic>
+                    </a:graphicData>
+                  </a:graphic>
+                </wp:inline>
+              </w:drawing>
+            </w:r>
+          </w:p>
+        </w:tc>
+      </w:tr>
     </w:tbl>
     <w:p/>
     <w:p>
@@ -1853,7 +1918,7 @@
               <w:drawing>
                 <wp:inline xmlns:a="http://schemas.openxmlformats.org/drawingml/2006/main" xmlns:pic="http://schemas.openxmlformats.org/drawingml/2006/picture">
                   <wp:extent cx="4320000" cy="2430000"/>
-                  <wp:docPr id="20" name="Picture 20"/>
+                  <wp:docPr id="21" name="Picture 21"/>
                   <wp:cNvGraphicFramePr>
                     <a:graphicFrameLocks noChangeAspect="1"/>
                   </wp:cNvGraphicFramePr>
@@ -1865,7 +1930,7 @@
                           <pic:cNvPicPr/>
                         </pic:nvPicPr>
                         <pic:blipFill>
-                          <a:blip r:embed="rId26"/>
+                          <a:blip r:embed="rId27"/>
                           <a:stretch>
                             <a:fillRect/>
                           </a:stretch>
@@ -1981,6 +2046,71 @@
                 <w:b/>
                 <w:sz w:val="22"/>
               </w:rPr>
+              <w:t>票务核销报表</w:t>
+            </w:r>
+          </w:p>
+        </w:tc>
+        <w:tc>
+          <w:tcPr>
+            <w:tcW w:type="dxa" w:w="4986"/>
+          </w:tcPr>
+          <w:p>
+            <w:pPr>
+              <w:jc w:val="center"/>
+            </w:pPr>
+            <w:r/>
+            <w:r>
+              <w:drawing>
+                <wp:inline xmlns:a="http://schemas.openxmlformats.org/drawingml/2006/main" xmlns:pic="http://schemas.openxmlformats.org/drawingml/2006/picture">
+                  <wp:extent cx="4320000" cy="2430000"/>
+                  <wp:docPr id="22" name="Picture 22"/>
+                  <wp:cNvGraphicFramePr>
+                    <a:graphicFrameLocks noChangeAspect="1"/>
+                  </wp:cNvGraphicFramePr>
+                  <a:graphic>
+                    <a:graphicData uri="http://schemas.openxmlformats.org/drawingml/2006/picture">
+                      <pic:pic>
+                        <pic:nvPicPr>
+                          <pic:cNvPr id="0" name="048_报表-票务核销报表.png"/>
+                          <pic:cNvPicPr/>
+                        </pic:nvPicPr>
+                        <pic:blipFill>
+                          <a:blip r:embed="rId28"/>
+                          <a:stretch>
+                            <a:fillRect/>
+                          </a:stretch>
+                        </pic:blipFill>
+                        <pic:spPr>
+                          <a:xfrm>
+                            <a:off x="0" y="0"/>
+                            <a:ext cx="4320000" cy="2430000"/>
+                          </a:xfrm>
+                          <a:prstGeom prst="rect"/>
+                        </pic:spPr>
+                      </pic:pic>
+                    </a:graphicData>
+                  </a:graphic>
+                </wp:inline>
+              </w:drawing>
+            </w:r>
+          </w:p>
+        </w:tc>
+      </w:tr>
+      <w:tr>
+        <w:tc>
+          <w:tcPr>
+            <w:tcW w:type="dxa" w:w="4986"/>
+          </w:tcPr>
+          <w:p>
+            <w:pPr>
+              <w:jc w:val="center"/>
+            </w:pPr>
+            <w:r>
+              <w:rPr>
+                <w:rFonts w:ascii="Microsoft YaHei" w:hAnsi="Microsoft YaHei"/>
+                <w:b/>
+                <w:sz w:val="22"/>
+              </w:rPr>
               <w:t>教学核销报表</w:t>
             </w:r>
           </w:p>
@@ -1998,7 +2128,7 @@
               <w:drawing>
                 <wp:inline xmlns:a="http://schemas.openxmlformats.org/drawingml/2006/main" xmlns:pic="http://schemas.openxmlformats.org/drawingml/2006/picture">
                   <wp:extent cx="4320000" cy="2430000"/>
-                  <wp:docPr id="21" name="Picture 21"/>
+                  <wp:docPr id="23" name="Picture 23"/>
                   <wp:cNvGraphicFramePr>
                     <a:graphicFrameLocks noChangeAspect="1"/>
                   </wp:cNvGraphicFramePr>
@@ -2010,7 +2140,7 @@
                           <pic:cNvPicPr/>
                         </pic:nvPicPr>
                         <pic:blipFill>
-                          <a:blip r:embed="rId27"/>
+                          <a:blip r:embed="rId29"/>
                           <a:stretch>
                             <a:fillRect/>
                           </a:stretch>
@@ -2143,7 +2273,7 @@
               <w:drawing>
                 <wp:inline xmlns:a="http://schemas.openxmlformats.org/drawingml/2006/main" xmlns:pic="http://schemas.openxmlformats.org/drawingml/2006/picture">
                   <wp:extent cx="4320000" cy="2430000"/>
-                  <wp:docPr id="22" name="Picture 22"/>
+                  <wp:docPr id="24" name="Picture 24"/>
                   <wp:cNvGraphicFramePr>
                     <a:graphicFrameLocks noChangeAspect="1"/>
                   </wp:cNvGraphicFramePr>
@@ -2155,7 +2285,7 @@
                           <pic:cNvPicPr/>
                         </pic:nvPicPr>
                         <pic:blipFill>
-                          <a:blip r:embed="rId28"/>
+                          <a:blip r:embed="rId30"/>
                           <a:stretch>
                             <a:fillRect/>
                           </a:stretch>
@@ -2208,7 +2338,7 @@
               <w:drawing>
                 <wp:inline xmlns:a="http://schemas.openxmlformats.org/drawingml/2006/main" xmlns:pic="http://schemas.openxmlformats.org/drawingml/2006/picture">
                   <wp:extent cx="4320000" cy="2430000"/>
-                  <wp:docPr id="23" name="Picture 23"/>
+                  <wp:docPr id="25" name="Picture 25"/>
                   <wp:cNvGraphicFramePr>
                     <a:graphicFrameLocks noChangeAspect="1"/>
                   </wp:cNvGraphicFramePr>
@@ -2220,7 +2350,7 @@
                           <pic:cNvPicPr/>
                         </pic:nvPicPr>
                         <pic:blipFill>
-                          <a:blip r:embed="rId29"/>
+                          <a:blip r:embed="rId31"/>
                           <a:stretch>
                             <a:fillRect/>
                           </a:stretch>
@@ -2273,7 +2403,7 @@
               <w:drawing>
                 <wp:inline xmlns:a="http://schemas.openxmlformats.org/drawingml/2006/main" xmlns:pic="http://schemas.openxmlformats.org/drawingml/2006/picture">
                   <wp:extent cx="4320000" cy="2430000"/>
-                  <wp:docPr id="24" name="Picture 24"/>
+                  <wp:docPr id="26" name="Picture 26"/>
                   <wp:cNvGraphicFramePr>
                     <a:graphicFrameLocks noChangeAspect="1"/>
                   </wp:cNvGraphicFramePr>
@@ -2285,7 +2415,7 @@
                           <pic:cNvPicPr/>
                         </pic:nvPicPr>
                         <pic:blipFill>
-                          <a:blip r:embed="rId30"/>
+                          <a:blip r:embed="rId32"/>
                           <a:stretch>
                             <a:fillRect/>
                           </a:stretch>
@@ -2338,7 +2468,7 @@
               <w:drawing>
                 <wp:inline xmlns:a="http://schemas.openxmlformats.org/drawingml/2006/main" xmlns:pic="http://schemas.openxmlformats.org/drawingml/2006/picture">
                   <wp:extent cx="4320000" cy="2430000"/>
-                  <wp:docPr id="25" name="Picture 25"/>
+                  <wp:docPr id="27" name="Picture 27"/>
                   <wp:cNvGraphicFramePr>
                     <a:graphicFrameLocks noChangeAspect="1"/>
                   </wp:cNvGraphicFramePr>
@@ -2350,7 +2480,7 @@
                           <pic:cNvPicPr/>
                         </pic:nvPicPr>
                         <pic:blipFill>
-                          <a:blip r:embed="rId31"/>
+                          <a:blip r:embed="rId33"/>
                           <a:stretch>
                             <a:fillRect/>
                           </a:stretch>
@@ -2403,7 +2533,7 @@
               <w:drawing>
                 <wp:inline xmlns:a="http://schemas.openxmlformats.org/drawingml/2006/main" xmlns:pic="http://schemas.openxmlformats.org/drawingml/2006/picture">
                   <wp:extent cx="4320000" cy="2430000"/>
-                  <wp:docPr id="26" name="Picture 26"/>
+                  <wp:docPr id="28" name="Picture 28"/>
                   <wp:cNvGraphicFramePr>
                     <a:graphicFrameLocks noChangeAspect="1"/>
                   </wp:cNvGraphicFramePr>
@@ -2415,7 +2545,7 @@
                           <pic:cNvPicPr/>
                         </pic:nvPicPr>
                         <pic:blipFill>
-                          <a:blip r:embed="rId32"/>
+                          <a:blip r:embed="rId34"/>
                           <a:stretch>
                             <a:fillRect/>
                           </a:stretch>
@@ -2468,7 +2598,7 @@
               <w:drawing>
                 <wp:inline xmlns:a="http://schemas.openxmlformats.org/drawingml/2006/main" xmlns:pic="http://schemas.openxmlformats.org/drawingml/2006/picture">
                   <wp:extent cx="4320000" cy="2430000"/>
-                  <wp:docPr id="27" name="Picture 27"/>
+                  <wp:docPr id="29" name="Picture 29"/>
                   <wp:cNvGraphicFramePr>
                     <a:graphicFrameLocks noChangeAspect="1"/>
                   </wp:cNvGraphicFramePr>
@@ -2480,7 +2610,7 @@
                           <pic:cNvPicPr/>
                         </pic:nvPicPr>
                         <pic:blipFill>
-                          <a:blip r:embed="rId33"/>
+                          <a:blip r:embed="rId35"/>
                           <a:stretch>
                             <a:fillRect/>
                           </a:stretch>

</xml_diff>